<commit_message>
Add new levels and bosses: Implement Boss10Scene, Boss5Scene, Level3Scene to Level9Scene
- Introduced Boss10Scene featuring the King Scorpion with multiple phases and mechanics.
- Added Boss5Scene with the Stone Colossus, including phase transitions and enemy fragments.
- Created Level3Scene, Level4Scene, Level6Scene, Level7Scene, Level8Scene, and Level9Scene with unique objectives and enemy encounters.
- Implemented various gameplay mechanics such as ambush triggers, wave spawning, and environmental hazards like lava.
- Enhanced level completion checks and scoring systems across all new scenes.
</commit_message>
<xml_diff>
--- a/GDD_TheMonsterHunter.docx
+++ b/GDD_TheMonsterHunter.docx
@@ -31,7 +31,7 @@
           <w:sz w:val="28"/>
           <w:szCs w:val="28"/>
         </w:rPr>
-        <w:t xml:space="preserve">Game Design Document (GDD) Simplificado</w:t>
+        <w:t>Game Design Document (GDD)</w:t>
       </w:r>
     </w:p>
     <w:p>
@@ -66,12 +66,252 @@
     </w:p>
     <w:p>
       <w:pPr>
+        <w:jc w:val="center"/>
+      </w:pPr>
+      <w:r>
+        <w:rPr>
+          <w:rFonts w:ascii="Arial" w:hAnsi="Arial"/>
+          <w:b w:val="0"/>
+          <w:i w:val="0"/>
+          <w:color w:val="555555"/>
+          <w:sz w:val="22"/>
+        </w:rPr>
+        <w:t>Integrantes: [Nombre completo 1] · [Nombre completo 2] · [Nombre completo 3]</w:t>
+      </w:r>
+    </w:p>
+    <w:p>
+      <w:pPr>
+        <w:jc w:val="center"/>
+      </w:pPr>
+      <w:r>
+        <w:rPr>
+          <w:rFonts w:ascii="Arial" w:hAnsi="Arial"/>
+          <w:b w:val="0"/>
+          <w:i w:val="0"/>
+          <w:color w:val="555555"/>
+          <w:sz w:val="22"/>
+        </w:rPr>
+        <w:t>Docente: [Nombre del docente]</w:t>
+      </w:r>
+    </w:p>
+    <w:p>
+      <w:pPr>
+        <w:jc w:val="center"/>
+      </w:pPr>
+      <w:r>
+        <w:rPr>
+          <w:rFonts w:ascii="Arial" w:hAnsi="Arial"/>
+          <w:b w:val="0"/>
+          <w:i w:val="0"/>
+          <w:color w:val="888888"/>
+          <w:sz w:val="22"/>
+        </w:rPr>
+        <w:t>Fecha de entrega: [DD/MM/AAAA]   |   Versión del documento: 2.0 (extendida)</w:t>
+      </w:r>
+    </w:p>
+    <w:p>
+      <w:pPr>
         <w:pBdr>
           <w:bottom w:val="single" w:color="CCCCCC" w:sz="4" w:space="1"/>
         </w:pBdr>
         <w:spacing w:after="200" w:before="200"/>
       </w:pPr>
     </w:p>
+    <w:p>
+      <w:pPr>
+        <w:pStyle w:val="Heading1"/>
+      </w:pPr>
+      <w:r>
+        <w:rPr>
+          <w:rFonts w:ascii="Arial" w:hAnsi="Arial"/>
+          <w:b/>
+          <w:color w:val="1F4E79"/>
+          <w:sz w:val="32"/>
+        </w:rPr>
+        <w:t>Índice</w:t>
+      </w:r>
+    </w:p>
+    <w:p>
+      <w:r>
+        <w:rPr>
+          <w:rFonts w:ascii="Arial" w:hAnsi="Arial"/>
+          <w:color w:val="333333"/>
+          <w:sz w:val="22"/>
+        </w:rPr>
+        <w:t>1. Identidad del Proyecto</w:t>
+      </w:r>
+    </w:p>
+    <w:p>
+      <w:r>
+        <w:rPr>
+          <w:rFonts w:ascii="Arial" w:hAnsi="Arial"/>
+          <w:color w:val="333333"/>
+          <w:sz w:val="22"/>
+        </w:rPr>
+        <w:t>2. High Concept &amp; Pitch</w:t>
+      </w:r>
+    </w:p>
+    <w:p>
+      <w:r>
+        <w:rPr>
+          <w:rFonts w:ascii="Arial" w:hAnsi="Arial"/>
+          <w:color w:val="333333"/>
+          <w:sz w:val="22"/>
+        </w:rPr>
+        <w:t>3. Loop Principal de Juego</w:t>
+      </w:r>
+    </w:p>
+    <w:p>
+      <w:r>
+        <w:rPr>
+          <w:rFonts w:ascii="Arial" w:hAnsi="Arial"/>
+          <w:color w:val="333333"/>
+          <w:sz w:val="22"/>
+        </w:rPr>
+        <w:t>4. Estructura de Niveles</w:t>
+      </w:r>
+    </w:p>
+    <w:p>
+      <w:r>
+        <w:rPr>
+          <w:rFonts w:ascii="Arial" w:hAnsi="Arial"/>
+          <w:color w:val="333333"/>
+          <w:sz w:val="22"/>
+        </w:rPr>
+        <w:t>5. Protagonista — El Arquero</w:t>
+      </w:r>
+    </w:p>
+    <w:p>
+      <w:r>
+        <w:rPr>
+          <w:rFonts w:ascii="Arial" w:hAnsi="Arial"/>
+          <w:color w:val="333333"/>
+          <w:sz w:val="22"/>
+        </w:rPr>
+        <w:t>6. Habilidades del Arquero</w:t>
+      </w:r>
+    </w:p>
+    <w:p>
+      <w:r>
+        <w:rPr>
+          <w:rFonts w:ascii="Arial" w:hAnsi="Arial"/>
+          <w:color w:val="333333"/>
+          <w:sz w:val="22"/>
+        </w:rPr>
+        <w:t>7. Sistema de Monedas y Mejoras</w:t>
+      </w:r>
+    </w:p>
+    <w:p>
+      <w:r>
+        <w:rPr>
+          <w:rFonts w:ascii="Arial" w:hAnsi="Arial"/>
+          <w:color w:val="333333"/>
+          <w:sz w:val="22"/>
+        </w:rPr>
+        <w:t>8. Bestiario</w:t>
+      </w:r>
+    </w:p>
+    <w:p>
+      <w:r>
+        <w:rPr>
+          <w:rFonts w:ascii="Arial" w:hAnsi="Arial"/>
+          <w:color w:val="333333"/>
+          <w:sz w:val="22"/>
+        </w:rPr>
+        <w:t>9. Diseño de Bosses</w:t>
+      </w:r>
+    </w:p>
+    <w:p>
+      <w:r>
+        <w:rPr>
+          <w:rFonts w:ascii="Arial" w:hAnsi="Arial"/>
+          <w:color w:val="333333"/>
+          <w:sz w:val="22"/>
+        </w:rPr>
+        <w:t>10. Identidad Sonora</w:t>
+      </w:r>
+    </w:p>
+    <w:p>
+      <w:r>
+        <w:rPr>
+          <w:rFonts w:ascii="Arial" w:hAnsi="Arial"/>
+          <w:color w:val="333333"/>
+          <w:sz w:val="22"/>
+        </w:rPr>
+        <w:t>11. Delimitación de Scope</w:t>
+      </w:r>
+    </w:p>
+    <w:p>
+      <w:r>
+        <w:rPr>
+          <w:rFonts w:ascii="Arial" w:hAnsi="Arial"/>
+          <w:color w:val="333333"/>
+          <w:sz w:val="22"/>
+        </w:rPr>
+        <w:t>12. Especificaciones Técnicas y Controles</w:t>
+      </w:r>
+    </w:p>
+    <w:p>
+      <w:r>
+        <w:rPr>
+          <w:rFonts w:ascii="Arial" w:hAnsi="Arial"/>
+          <w:color w:val="333333"/>
+          <w:sz w:val="22"/>
+        </w:rPr>
+        <w:t>13. Balance Numérico (Stats Reales)</w:t>
+      </w:r>
+    </w:p>
+    <w:p>
+      <w:r>
+        <w:rPr>
+          <w:rFonts w:ascii="Arial" w:hAnsi="Arial"/>
+          <w:color w:val="333333"/>
+          <w:sz w:val="22"/>
+        </w:rPr>
+        <w:t>14. Estado de Implementación — MVP vs Visión Completa</w:t>
+      </w:r>
+    </w:p>
+    <w:p>
+      <w:r>
+        <w:rPr>
+          <w:rFonts w:ascii="Arial" w:hAnsi="Arial"/>
+          <w:color w:val="333333"/>
+          <w:sz w:val="22"/>
+        </w:rPr>
+        <w:t>15. Riesgos y Mitigaciones</w:t>
+      </w:r>
+    </w:p>
+    <w:p>
+      <w:r>
+        <w:rPr>
+          <w:rFonts w:ascii="Arial" w:hAnsi="Arial"/>
+          <w:color w:val="333333"/>
+          <w:sz w:val="22"/>
+        </w:rPr>
+        <w:t>16. Plan de Producción (Roadmap)</w:t>
+      </w:r>
+    </w:p>
+    <w:p>
+      <w:r>
+        <w:rPr>
+          <w:rFonts w:ascii="Arial" w:hAnsi="Arial"/>
+          <w:color w:val="333333"/>
+          <w:sz w:val="22"/>
+        </w:rPr>
+        <w:t>17. Referencias e Inspiración</w:t>
+      </w:r>
+    </w:p>
+    <w:p>
+      <w:r>
+        <w:rPr>
+          <w:rFonts w:ascii="Arial" w:hAnsi="Arial"/>
+          <w:color w:val="333333"/>
+          <w:sz w:val="22"/>
+        </w:rPr>
+        <w:t>18. Equipo y Créditos</w:t>
+      </w:r>
+    </w:p>
+    <w:p/>
     <w:p>
       <w:pPr>
         <w:pStyle w:val="Heading1"/>
@@ -2807,6 +3047,17 @@
       </w:tr>
     </w:tbl>
     <w:p>
+      <w:r>
+        <w:rPr>
+          <w:rFonts w:ascii="Arial" w:hAnsi="Arial"/>
+          <w:i/>
+          <w:color w:val="555555"/>
+          <w:sz w:val="20"/>
+        </w:rPr>
+        <w:t>Nota: el MVP jugable actual no sigue esta progresión de forma literal. Ver la sección 14 (Estado de Implementación) para el detalle exacto de qué hay hoy en código.</w:t>
+      </w:r>
+    </w:p>
+    <w:p>
       <w:pPr>
         <w:spacing w:before="200"/>
       </w:pPr>
@@ -5618,7 +5869,7 @@
           <w:sz w:val="22"/>
           <w:szCs w:val="22"/>
         </w:rPr>
-        <w:t xml:space="preserve">Fase 1: Golem gigante que camina lento y aplasta con los brazos. Patron: adelanta-aplasta-retrocede.</w:t>
+        <w:t>Fase 1: Golem gigante que camina lento y aplasta con los brazos. Patrón: adelanta-aplasta-retrocede.</w:t>
       </w:r>
     </w:p>
     <w:p>
@@ -5654,7 +5905,7 @@
           <w:sz w:val="22"/>
           <w:szCs w:val="22"/>
         </w:rPr>
-        <w:t xml:space="preserve">Invoca Espiritus de arena en la fase 2 (solo vulnerables a flechas electricas o explosivas).</w:t>
+        <w:t>Invoca Espíritus de arena en la fase 2 (solo vulnerables a flechas eléctricas o explosivas).</w:t>
       </w:r>
     </w:p>
     <w:p>
@@ -5694,7 +5945,7 @@
           <w:sz w:val="26"/>
           <w:szCs w:val="26"/>
         </w:rPr>
-        <w:t xml:space="preserve">Boss Final — El Rey Escorpion (Nivel 10)</w:t>
+        <w:t>Boss Final — El Rey Escorpión (Nivel 10)</w:t>
       </w:r>
     </w:p>
     <w:p>
@@ -5712,7 +5963,7 @@
           <w:sz w:val="22"/>
           <w:szCs w:val="22"/>
         </w:rPr>
-        <w:t xml:space="preserve">Fase 1: Ataca con cola en arco amplio. Patron predecible, permite farm de posicion.</w:t>
+        <w:t>Fase 1: Ataca con cola en arco amplio. Patrón predecible, permite farm de posición.</w:t>
       </w:r>
     </w:p>
     <w:p>
@@ -5861,7 +6112,7 @@
                 <w:sz w:val="20"/>
                 <w:szCs w:val="20"/>
               </w:rPr>
-              <w:t xml:space="preserve">Ambient tranquilo, percusion suave tipo desierto. No agresiva para no estresar al jugador.</w:t>
+              <w:t>Ambient tranquilo, percusión suave tipo desierto. No agresiva para no estresar al jugador.</w:t>
             </w:r>
           </w:p>
         </w:tc>
@@ -5920,7 +6171,7 @@
                 <w:sz w:val="20"/>
                 <w:szCs w:val="20"/>
               </w:rPr>
-              <w:t xml:space="preserve">Ritmo mas tenso, cuerdas graves, sensacion de urgencia creciente.</w:t>
+              <w:t>Ritmo más tenso, cuerdas graves, sensación de urgencia creciente.</w:t>
             </w:r>
           </w:p>
         </w:tc>
@@ -5979,7 +6230,7 @@
                 <w:sz w:val="20"/>
                 <w:szCs w:val="20"/>
               </w:rPr>
-              <w:t xml:space="preserve">Orquesta epica con tambores marciales. Cambio dinamico al entrar a fase 2 y 3.</w:t>
+              <w:t>Orquesta épica con tambores marciales. Cambio dinámico al entrar a fase 2 y 3.</w:t>
             </w:r>
           </w:p>
         </w:tc>
@@ -6038,7 +6289,7 @@
                 <w:sz w:val="20"/>
                 <w:szCs w:val="20"/>
               </w:rPr>
-              <w:t xml:space="preserve">Melodia breve, melancolica. Incentiva reintentar.</w:t>
+              <w:t>Melodía breve, melancólica. Incentiva reintentar.</w:t>
             </w:r>
           </w:p>
         </w:tc>
@@ -6097,7 +6348,7 @@
                 <w:sz w:val="20"/>
                 <w:szCs w:val="20"/>
               </w:rPr>
-              <w:t xml:space="preserve">Disparo de flecha, impacto en enemigo, dano recibido, recoger moneda, muerte arquero, subir de nivel, activar habilidad, boss entra en fase nueva.</w:t>
+              <w:t>Disparo de flecha, impacto en enemigo, daño recibido, recoger moneda, muerte arquero, subir de nivel, activar habilidad, boss entra en fase nueva.</w:t>
             </w:r>
           </w:p>
         </w:tc>
@@ -6156,7 +6407,7 @@
                 <w:sz w:val="20"/>
                 <w:szCs w:val="20"/>
               </w:rPr>
-              <w:t xml:space="preserve">Viento de desierto constante, pasos sobre arena, tormenta de fondo (nivel 4), crujidos del golem (Boss 1), rugido del escorpion (Boss 2).</w:t>
+              <w:t>Viento de desierto constante, pasos sobre arena, tormenta de fondo (nivel 4), crujidos del golem (Boss 1), rugido del escorpión (Boss 2).</w:t>
             </w:r>
           </w:p>
         </w:tc>
@@ -6181,7 +6432,7 @@
           <w:sz w:val="32"/>
           <w:szCs w:val="32"/>
         </w:rPr>
-        <w:t xml:space="preserve">11. Delimitacion de Scope</w:t>
+        <w:t>11. Delimitación de Scope</w:t>
       </w:r>
     </w:p>
     <w:p>
@@ -6230,7 +6481,7 @@
           <w:sz w:val="22"/>
           <w:szCs w:val="22"/>
         </w:rPr>
-        <w:t xml:space="preserve">1 personaje jugable (el arquero). No hay seleccion de clases ni multijugador.</w:t>
+        <w:t>1 personaje jugable (el arquero). No hay selección de clases ni multijugador.</w:t>
       </w:r>
     </w:p>
     <w:p>
@@ -6248,7 +6499,7 @@
           <w:sz w:val="22"/>
           <w:szCs w:val="22"/>
         </w:rPr>
-        <w:t xml:space="preserve">10 habilidades de flecha. No se agregan nuevas sin revision del equipo.</w:t>
+        <w:t>10 habilidades de flecha. No se agregan nuevas sin revisión del equipo.</w:t>
       </w:r>
     </w:p>
     <w:p>
@@ -6284,7 +6535,7 @@
           <w:sz w:val="22"/>
           <w:szCs w:val="22"/>
         </w:rPr>
-        <w:t xml:space="preserve">5 stats mejorables. Economia simple sin crafteo ni inventario.</w:t>
+        <w:t>5 stats mejorables. Economía simple sin crafteo ni inventario.</w:t>
       </w:r>
     </w:p>
     <w:p>
@@ -6302,7 +6553,7 @@
           <w:sz w:val="22"/>
           <w:szCs w:val="22"/>
         </w:rPr>
-        <w:t xml:space="preserve">Roguelike puro: no hay meta-progresion entre runs (no se conserva nada al morir).</w:t>
+        <w:t>Roguelike puro: no hay meta-progresión entre runs (no se conserva nada al morir).</w:t>
       </w:r>
     </w:p>
     <w:p>
@@ -6310,6 +6561,3772 @@
         <w:spacing w:before="120"/>
       </w:pPr>
     </w:p>
+    <w:p/>
+    <w:p>
+      <w:pPr>
+        <w:pStyle w:val="Heading1"/>
+      </w:pPr>
+      <w:r>
+        <w:rPr>
+          <w:rFonts w:ascii="Arial" w:hAnsi="Arial"/>
+          <w:b/>
+          <w:color w:val="1F4E79"/>
+          <w:sz w:val="32"/>
+        </w:rPr>
+        <w:t>12. Especificaciones Técnicas y Controles</w:t>
+      </w:r>
+    </w:p>
+    <w:p>
+      <w:pPr>
+        <w:pStyle w:val="Heading2"/>
+      </w:pPr>
+      <w:r>
+        <w:rPr>
+          <w:rFonts w:ascii="Arial" w:hAnsi="Arial"/>
+          <w:b/>
+          <w:color w:val="2E75B6"/>
+          <w:sz w:val="26"/>
+        </w:rPr>
+        <w:t>Motor y stack</w:t>
+      </w:r>
+    </w:p>
+    <w:tbl>
+      <w:tblPr>
+        <w:tblW w:type="auto" w:w="0"/>
+        <w:tblLayout w:type="fixed"/>
+        <w:tblLook w:firstColumn="1" w:firstRow="1" w:lastColumn="0" w:lastRow="0" w:noHBand="0" w:noVBand="1" w:val="04A0"/>
+        <w:tblBorders>
+          <w:top w:val="single" w:color="auto" w:sz="4"/>
+          <w:left w:val="single" w:color="auto" w:sz="4"/>
+          <w:bottom w:val="single" w:color="auto" w:sz="4"/>
+          <w:right w:val="single" w:color="auto" w:sz="4"/>
+          <w:insideH w:val="single" w:color="auto" w:sz="4"/>
+          <w:insideV w:val="single" w:color="auto" w:sz="4"/>
+        </w:tblBorders>
+      </w:tblPr>
+      <w:tblGrid>
+        <w:gridCol w:w="4513"/>
+        <w:gridCol w:w="4513"/>
+      </w:tblGrid>
+      <w:tr>
+        <w:tc>
+          <w:tcPr>
+            <w:tcW w:type="dxa" w:w="2800"/>
+            <w:shd w:val="clear" w:color="auto" w:fill="D6E4F0"/>
+          </w:tcPr>
+          <w:p>
+            <w:r/>
+            <w:r>
+              <w:rPr>
+                <w:rFonts w:ascii="Arial" w:hAnsi="Arial"/>
+                <w:b/>
+                <w:sz w:val="20"/>
+              </w:rPr>
+              <w:t>Motor</w:t>
+            </w:r>
+          </w:p>
+        </w:tc>
+        <w:tc>
+          <w:tcPr>
+            <w:tcW w:type="dxa" w:w="6560"/>
+          </w:tcPr>
+          <w:p>
+            <w:r/>
+            <w:r>
+              <w:rPr>
+                <w:rFonts w:ascii="Arial" w:hAnsi="Arial"/>
+                <w:b w:val="0"/>
+                <w:sz w:val="20"/>
+              </w:rPr>
+              <w:t>Phaser 3 (JavaScript, ES Modules), sin build step</w:t>
+            </w:r>
+          </w:p>
+        </w:tc>
+      </w:tr>
+      <w:tr>
+        <w:tc>
+          <w:tcPr>
+            <w:tcW w:type="dxa" w:w="2800"/>
+            <w:shd w:val="clear" w:color="auto" w:fill="D6E4F0"/>
+          </w:tcPr>
+          <w:p>
+            <w:r/>
+            <w:r>
+              <w:rPr>
+                <w:rFonts w:ascii="Arial" w:hAnsi="Arial"/>
+                <w:b/>
+                <w:sz w:val="20"/>
+              </w:rPr>
+              <w:t>Mapas</w:t>
+            </w:r>
+          </w:p>
+        </w:tc>
+        <w:tc>
+          <w:tcPr>
+            <w:tcW w:type="dxa" w:w="6560"/>
+          </w:tcPr>
+          <w:p>
+            <w:r/>
+            <w:r>
+              <w:rPr>
+                <w:rFonts w:ascii="Arial" w:hAnsi="Arial"/>
+                <w:b w:val="0"/>
+                <w:sz w:val="20"/>
+              </w:rPr>
+              <w:t>Tiled, exportado a JSON. Capas usadas: ground, walls, danger, objects</w:t>
+            </w:r>
+          </w:p>
+        </w:tc>
+      </w:tr>
+      <w:tr>
+        <w:tc>
+          <w:tcPr>
+            <w:tcW w:type="dxa" w:w="2800"/>
+            <w:shd w:val="clear" w:color="auto" w:fill="D6E4F0"/>
+          </w:tcPr>
+          <w:p>
+            <w:r/>
+            <w:r>
+              <w:rPr>
+                <w:rFonts w:ascii="Arial" w:hAnsi="Arial"/>
+                <w:b/>
+                <w:sz w:val="20"/>
+              </w:rPr>
+              <w:t>Resolución base</w:t>
+            </w:r>
+          </w:p>
+        </w:tc>
+        <w:tc>
+          <w:tcPr>
+            <w:tcW w:type="dxa" w:w="6560"/>
+          </w:tcPr>
+          <w:p>
+            <w:r/>
+            <w:r>
+              <w:rPr>
+                <w:rFonts w:ascii="Arial" w:hAnsi="Arial"/>
+                <w:b w:val="0"/>
+                <w:sz w:val="20"/>
+              </w:rPr>
+              <w:t>960 × 540 px, cámara con zoom 1x y seguimiento suave (lerp 0.08) al jugador</w:t>
+            </w:r>
+          </w:p>
+        </w:tc>
+      </w:tr>
+      <w:tr>
+        <w:tc>
+          <w:tcPr>
+            <w:tcW w:type="dxa" w:w="2800"/>
+            <w:shd w:val="clear" w:color="auto" w:fill="D6E4F0"/>
+          </w:tcPr>
+          <w:p>
+            <w:r/>
+            <w:r>
+              <w:rPr>
+                <w:rFonts w:ascii="Arial" w:hAnsi="Arial"/>
+                <w:b/>
+                <w:sz w:val="20"/>
+              </w:rPr>
+              <w:t>Plataforma</w:t>
+            </w:r>
+          </w:p>
+        </w:tc>
+        <w:tc>
+          <w:tcPr>
+            <w:tcW w:type="dxa" w:w="6560"/>
+          </w:tcPr>
+          <w:p>
+            <w:r/>
+            <w:r>
+              <w:rPr>
+                <w:rFonts w:ascii="Arial" w:hAnsi="Arial"/>
+                <w:b w:val="0"/>
+                <w:sz w:val="20"/>
+              </w:rPr>
+              <w:t>Navegador de escritorio. Requiere servidor local (python3 -m http.server) — no funciona con doble clic por los módulos ES y los JSON</w:t>
+            </w:r>
+          </w:p>
+        </w:tc>
+      </w:tr>
+      <w:tr>
+        <w:tc>
+          <w:tcPr>
+            <w:tcW w:type="dxa" w:w="2800"/>
+            <w:shd w:val="clear" w:color="auto" w:fill="D6E4F0"/>
+          </w:tcPr>
+          <w:p>
+            <w:r/>
+            <w:r>
+              <w:rPr>
+                <w:rFonts w:ascii="Arial" w:hAnsi="Arial"/>
+                <w:b/>
+                <w:sz w:val="20"/>
+              </w:rPr>
+              <w:t>Arte del MVP</w:t>
+            </w:r>
+          </w:p>
+        </w:tc>
+        <w:tc>
+          <w:tcPr>
+            <w:tcW w:type="dxa" w:w="6560"/>
+          </w:tcPr>
+          <w:p>
+            <w:r/>
+            <w:r>
+              <w:rPr>
+                <w:rFonts w:ascii="Arial" w:hAnsi="Arial"/>
+                <w:b w:val="0"/>
+                <w:sz w:val="20"/>
+              </w:rPr>
+              <w:t>Sprites, tiles y efectos generados por código en PreloadScene.js. No depende de assets externos para ejecutarse</w:t>
+            </w:r>
+          </w:p>
+        </w:tc>
+      </w:tr>
+    </w:tbl>
+    <w:p/>
+    <w:p>
+      <w:pPr>
+        <w:pStyle w:val="Heading2"/>
+      </w:pPr>
+      <w:r>
+        <w:rPr>
+          <w:rFonts w:ascii="Arial" w:hAnsi="Arial"/>
+          <w:b/>
+          <w:color w:val="2E75B6"/>
+          <w:sz w:val="26"/>
+        </w:rPr>
+        <w:t>Controles</w:t>
+      </w:r>
+    </w:p>
+    <w:tbl>
+      <w:tblPr>
+        <w:tblW w:type="auto" w:w="0"/>
+        <w:tblLayout w:type="fixed"/>
+        <w:tblLook w:firstColumn="1" w:firstRow="1" w:lastColumn="0" w:lastRow="0" w:noHBand="0" w:noVBand="1" w:val="04A0"/>
+        <w:tblBorders>
+          <w:top w:val="single" w:color="auto" w:sz="4"/>
+          <w:left w:val="single" w:color="auto" w:sz="4"/>
+          <w:bottom w:val="single" w:color="auto" w:sz="4"/>
+          <w:right w:val="single" w:color="auto" w:sz="4"/>
+          <w:insideH w:val="single" w:color="auto" w:sz="4"/>
+          <w:insideV w:val="single" w:color="auto" w:sz="4"/>
+        </w:tblBorders>
+      </w:tblPr>
+      <w:tblGrid>
+        <w:gridCol w:w="4513"/>
+        <w:gridCol w:w="4513"/>
+      </w:tblGrid>
+      <w:tr>
+        <w:tc>
+          <w:tcPr>
+            <w:tcW w:type="dxa" w:w="2800"/>
+            <w:shd w:val="clear" w:color="auto" w:fill="D6E4F0"/>
+          </w:tcPr>
+          <w:p>
+            <w:r/>
+            <w:r>
+              <w:rPr>
+                <w:rFonts w:ascii="Arial" w:hAnsi="Arial"/>
+                <w:b/>
+                <w:sz w:val="20"/>
+              </w:rPr>
+              <w:t>Movimiento</w:t>
+            </w:r>
+          </w:p>
+        </w:tc>
+        <w:tc>
+          <w:tcPr>
+            <w:tcW w:type="dxa" w:w="6560"/>
+          </w:tcPr>
+          <w:p>
+            <w:r/>
+            <w:r>
+              <w:rPr>
+                <w:rFonts w:ascii="Arial" w:hAnsi="Arial"/>
+                <w:b w:val="0"/>
+                <w:sz w:val="20"/>
+              </w:rPr>
+              <w:t>WASD o flechas direccionales</w:t>
+            </w:r>
+          </w:p>
+        </w:tc>
+      </w:tr>
+      <w:tr>
+        <w:tc>
+          <w:tcPr>
+            <w:tcW w:type="dxa" w:w="2800"/>
+            <w:shd w:val="clear" w:color="auto" w:fill="D6E4F0"/>
+          </w:tcPr>
+          <w:p>
+            <w:r/>
+            <w:r>
+              <w:rPr>
+                <w:rFonts w:ascii="Arial" w:hAnsi="Arial"/>
+                <w:b/>
+                <w:sz w:val="20"/>
+              </w:rPr>
+              <w:t>Disparo dirigido</w:t>
+            </w:r>
+          </w:p>
+        </w:tc>
+        <w:tc>
+          <w:tcPr>
+            <w:tcW w:type="dxa" w:w="6560"/>
+          </w:tcPr>
+          <w:p>
+            <w:r/>
+            <w:r>
+              <w:rPr>
+                <w:rFonts w:ascii="Arial" w:hAnsi="Arial"/>
+                <w:b w:val="0"/>
+                <w:sz w:val="20"/>
+              </w:rPr>
+              <w:t>Click izquierdo — dispara hacia la posición del cursor</w:t>
+            </w:r>
+          </w:p>
+        </w:tc>
+      </w:tr>
+      <w:tr>
+        <w:tc>
+          <w:tcPr>
+            <w:tcW w:type="dxa" w:w="2800"/>
+            <w:shd w:val="clear" w:color="auto" w:fill="D6E4F0"/>
+          </w:tcPr>
+          <w:p>
+            <w:r/>
+            <w:r>
+              <w:rPr>
+                <w:rFonts w:ascii="Arial" w:hAnsi="Arial"/>
+                <w:b/>
+                <w:sz w:val="20"/>
+              </w:rPr>
+              <w:t>Disparo rápido</w:t>
+            </w:r>
+          </w:p>
+        </w:tc>
+        <w:tc>
+          <w:tcPr>
+            <w:tcW w:type="dxa" w:w="6560"/>
+          </w:tcPr>
+          <w:p>
+            <w:r/>
+            <w:r>
+              <w:rPr>
+                <w:rFonts w:ascii="Arial" w:hAnsi="Arial"/>
+                <w:b w:val="0"/>
+                <w:sz w:val="20"/>
+              </w:rPr>
+              <w:t>ESPACIO — dispara hacia la última dirección de movimiento</w:t>
+            </w:r>
+          </w:p>
+        </w:tc>
+      </w:tr>
+      <w:tr>
+        <w:tc>
+          <w:tcPr>
+            <w:tcW w:type="dxa" w:w="2800"/>
+            <w:shd w:val="clear" w:color="auto" w:fill="D6E4F0"/>
+          </w:tcPr>
+          <w:p>
+            <w:r/>
+            <w:r>
+              <w:rPr>
+                <w:rFonts w:ascii="Arial" w:hAnsi="Arial"/>
+                <w:b/>
+                <w:sz w:val="20"/>
+              </w:rPr>
+              <w:t>Volver al menú</w:t>
+            </w:r>
+          </w:p>
+        </w:tc>
+        <w:tc>
+          <w:tcPr>
+            <w:tcW w:type="dxa" w:w="6560"/>
+          </w:tcPr>
+          <w:p>
+            <w:r/>
+            <w:r>
+              <w:rPr>
+                <w:rFonts w:ascii="Arial" w:hAnsi="Arial"/>
+                <w:b w:val="0"/>
+                <w:sz w:val="20"/>
+              </w:rPr>
+              <w:t>ESC — detiene el nivel actual y vuelve a MenuScene</w:t>
+            </w:r>
+          </w:p>
+        </w:tc>
+      </w:tr>
+    </w:tbl>
+    <w:p/>
+    <w:p>
+      <w:pPr>
+        <w:pStyle w:val="Heading2"/>
+      </w:pPr>
+      <w:r>
+        <w:rPr>
+          <w:rFonts w:ascii="Arial" w:hAnsi="Arial"/>
+          <w:b/>
+          <w:color w:val="2E75B6"/>
+          <w:sz w:val="26"/>
+        </w:rPr>
+        <w:t>HUD en juego (UIScene)</w:t>
+      </w:r>
+    </w:p>
+    <w:p>
+      <w:pPr>
+        <w:pStyle w:val="ListParagraph"/>
+        <w:numPr>
+          <w:ilvl w:val="0"/>
+          <w:numId w:val="2"/>
+        </w:numPr>
+      </w:pPr>
+      <w:r>
+        <w:rPr>
+          <w:rFonts w:ascii="Arial" w:hAnsi="Arial"/>
+          <w:sz w:val="22"/>
+        </w:rPr>
+        <w:t>Barra superior translúcida con: nombre del nivel, score, monedas, cantidad de habilidades activas y daño de flecha actual.</w:t>
+      </w:r>
+    </w:p>
+    <w:p>
+      <w:pPr>
+        <w:pStyle w:val="ListParagraph"/>
+        <w:numPr>
+          <w:ilvl w:val="0"/>
+          <w:numId w:val="2"/>
+        </w:numPr>
+      </w:pPr>
+      <w:r>
+        <w:rPr>
+          <w:rFonts w:ascii="Arial" w:hAnsi="Arial"/>
+          <w:sz w:val="22"/>
+        </w:rPr>
+        <w:t>Barra de HP con relleno proporcional (verde) y valor numérico HP/HP máximo, actualizada en tiempo real.</w:t>
+      </w:r>
+    </w:p>
+    <w:p>
+      <w:pPr>
+        <w:pStyle w:val="ListParagraph"/>
+        <w:numPr>
+          <w:ilvl w:val="0"/>
+          <w:numId w:val="2"/>
+        </w:numPr>
+      </w:pPr>
+      <w:r>
+        <w:rPr>
+          <w:rFonts w:ascii="Arial" w:hAnsi="Arial"/>
+          <w:sz w:val="22"/>
+        </w:rPr>
+        <w:t>Aviso de objetivo del nivel: aparece al iniciar y se desvanece a los 4–4.5 segundos.</w:t>
+      </w:r>
+    </w:p>
+    <w:p/>
+    <w:p>
+      <w:pPr>
+        <w:pStyle w:val="Heading1"/>
+      </w:pPr>
+      <w:r>
+        <w:rPr>
+          <w:rFonts w:ascii="Arial" w:hAnsi="Arial"/>
+          <w:b/>
+          <w:color w:val="1F4E79"/>
+          <w:sz w:val="32"/>
+        </w:rPr>
+        <w:t>13. Balance Numérico (Stats Reales)</w:t>
+      </w:r>
+    </w:p>
+    <w:p>
+      <w:r>
+        <w:rPr>
+          <w:rFonts w:ascii="Arial" w:hAnsi="Arial"/>
+          <w:b w:val="0"/>
+          <w:i/>
+          <w:color w:val="412402"/>
+          <w:sz w:val="26"/>
+        </w:rPr>
+        <w:t>Estos valores están tomados directamente del código (config.js, runState.js, BaseLevelScene.js) y reflejan el balance real del MVP jugable, no solo la intención de diseño de las secciones anteriores.</w:t>
+      </w:r>
+    </w:p>
+    <w:p/>
+    <w:p>
+      <w:pPr>
+        <w:pStyle w:val="Heading2"/>
+      </w:pPr>
+      <w:r>
+        <w:rPr>
+          <w:rFonts w:ascii="Arial" w:hAnsi="Arial"/>
+          <w:b/>
+          <w:color w:val="2E75B6"/>
+          <w:sz w:val="26"/>
+        </w:rPr>
+        <w:t>Stats base del arquero</w:t>
+      </w:r>
+    </w:p>
+    <w:tbl>
+      <w:tblPr>
+        <w:tblW w:type="auto" w:w="0"/>
+        <w:tblLayout w:type="fixed"/>
+        <w:tblLook w:firstColumn="1" w:firstRow="1" w:lastColumn="0" w:lastRow="0" w:noHBand="0" w:noVBand="1" w:val="04A0"/>
+        <w:tblBorders>
+          <w:top w:val="single" w:color="auto" w:sz="4"/>
+          <w:left w:val="single" w:color="auto" w:sz="4"/>
+          <w:bottom w:val="single" w:color="auto" w:sz="4"/>
+          <w:right w:val="single" w:color="auto" w:sz="4"/>
+          <w:insideH w:val="single" w:color="auto" w:sz="4"/>
+          <w:insideV w:val="single" w:color="auto" w:sz="4"/>
+        </w:tblBorders>
+      </w:tblPr>
+      <w:tblGrid>
+        <w:gridCol w:w="3009"/>
+        <w:gridCol w:w="3009"/>
+        <w:gridCol w:w="3009"/>
+      </w:tblGrid>
+      <w:tr>
+        <w:tc>
+          <w:tcPr>
+            <w:tcW w:type="dxa" w:w="2520"/>
+            <w:shd w:val="clear" w:color="auto" w:fill="2E75B6"/>
+          </w:tcPr>
+          <w:p>
+            <w:r/>
+            <w:r>
+              <w:rPr>
+                <w:rFonts w:ascii="Arial" w:hAnsi="Arial"/>
+                <w:b/>
+                <w:color w:val="FFFFFF"/>
+                <w:sz w:val="18"/>
+              </w:rPr>
+              <w:t>Stat</w:t>
+            </w:r>
+          </w:p>
+        </w:tc>
+        <w:tc>
+          <w:tcPr>
+            <w:tcW w:type="dxa" w:w="3465"/>
+            <w:shd w:val="clear" w:color="auto" w:fill="2E75B6"/>
+          </w:tcPr>
+          <w:p>
+            <w:r/>
+            <w:r>
+              <w:rPr>
+                <w:rFonts w:ascii="Arial" w:hAnsi="Arial"/>
+                <w:b/>
+                <w:color w:val="FFFFFF"/>
+                <w:sz w:val="18"/>
+              </w:rPr>
+              <w:t>Valor base</w:t>
+            </w:r>
+          </w:p>
+        </w:tc>
+        <w:tc>
+          <w:tcPr>
+            <w:tcW w:type="dxa" w:w="3376"/>
+            <w:shd w:val="clear" w:color="auto" w:fill="2E75B6"/>
+          </w:tcPr>
+          <w:p>
+            <w:r/>
+            <w:r>
+              <w:rPr>
+                <w:rFonts w:ascii="Arial" w:hAnsi="Arial"/>
+                <w:b/>
+                <w:color w:val="FFFFFF"/>
+                <w:sz w:val="18"/>
+              </w:rPr>
+              <w:t>Efecto de mejora</w:t>
+            </w:r>
+          </w:p>
+        </w:tc>
+      </w:tr>
+      <w:tr>
+        <w:tc>
+          <w:tcPr>
+            <w:tcW w:type="dxa" w:w="2520"/>
+            <w:shd w:val="clear" w:color="auto" w:fill="F7FBFF"/>
+          </w:tcPr>
+          <w:p>
+            <w:r/>
+            <w:r>
+              <w:rPr>
+                <w:rFonts w:ascii="Arial" w:hAnsi="Arial"/>
+                <w:b/>
+                <w:sz w:val="18"/>
+              </w:rPr>
+              <w:t>HP máximo</w:t>
+            </w:r>
+          </w:p>
+        </w:tc>
+        <w:tc>
+          <w:tcPr>
+            <w:tcW w:type="dxa" w:w="3465"/>
+            <w:shd w:val="clear" w:color="auto" w:fill="F7FBFF"/>
+          </w:tcPr>
+          <w:p>
+            <w:r/>
+            <w:r>
+              <w:rPr>
+                <w:rFonts w:ascii="Arial" w:hAnsi="Arial"/>
+                <w:b w:val="0"/>
+                <w:sz w:val="18"/>
+              </w:rPr>
+              <w:t>100</w:t>
+            </w:r>
+          </w:p>
+        </w:tc>
+        <w:tc>
+          <w:tcPr>
+            <w:tcW w:type="dxa" w:w="3376"/>
+            <w:shd w:val="clear" w:color="auto" w:fill="F7FBFF"/>
+          </w:tcPr>
+          <w:p>
+            <w:r/>
+            <w:r>
+              <w:rPr>
+                <w:rFonts w:ascii="Arial" w:hAnsi="Arial"/>
+                <w:b w:val="0"/>
+                <w:sz w:val="18"/>
+              </w:rPr>
+              <w:t>+20 por nivel de "Salud máxima"</w:t>
+            </w:r>
+          </w:p>
+        </w:tc>
+      </w:tr>
+      <w:tr>
+        <w:tc>
+          <w:tcPr>
+            <w:tcW w:type="dxa" w:w="2520"/>
+            <w:shd w:val="clear" w:color="auto" w:fill="FFFFFF"/>
+          </w:tcPr>
+          <w:p>
+            <w:r/>
+            <w:r>
+              <w:rPr>
+                <w:rFonts w:ascii="Arial" w:hAnsi="Arial"/>
+                <w:b/>
+                <w:sz w:val="18"/>
+              </w:rPr>
+              <w:t>Velocidad de movimiento</w:t>
+            </w:r>
+          </w:p>
+        </w:tc>
+        <w:tc>
+          <w:tcPr>
+            <w:tcW w:type="dxa" w:w="3465"/>
+            <w:shd w:val="clear" w:color="auto" w:fill="FFFFFF"/>
+          </w:tcPr>
+          <w:p>
+            <w:r/>
+            <w:r>
+              <w:rPr>
+                <w:rFonts w:ascii="Arial" w:hAnsi="Arial"/>
+                <w:b w:val="0"/>
+                <w:sz w:val="18"/>
+              </w:rPr>
+              <w:t>175 px/s</w:t>
+            </w:r>
+          </w:p>
+        </w:tc>
+        <w:tc>
+          <w:tcPr>
+            <w:tcW w:type="dxa" w:w="3376"/>
+            <w:shd w:val="clear" w:color="auto" w:fill="FFFFFF"/>
+          </w:tcPr>
+          <w:p>
+            <w:r/>
+            <w:r>
+              <w:rPr>
+                <w:rFonts w:ascii="Arial" w:hAnsi="Arial"/>
+                <w:b w:val="0"/>
+                <w:sz w:val="18"/>
+              </w:rPr>
+              <w:t>+10% por nivel de "Velocidad"</w:t>
+            </w:r>
+          </w:p>
+        </w:tc>
+      </w:tr>
+      <w:tr>
+        <w:tc>
+          <w:tcPr>
+            <w:tcW w:type="dxa" w:w="2520"/>
+            <w:shd w:val="clear" w:color="auto" w:fill="F7FBFF"/>
+          </w:tcPr>
+          <w:p>
+            <w:r/>
+            <w:r>
+              <w:rPr>
+                <w:rFonts w:ascii="Arial" w:hAnsi="Arial"/>
+                <w:b/>
+                <w:sz w:val="18"/>
+              </w:rPr>
+              <w:t>Daño de flecha</w:t>
+            </w:r>
+          </w:p>
+        </w:tc>
+        <w:tc>
+          <w:tcPr>
+            <w:tcW w:type="dxa" w:w="3465"/>
+            <w:shd w:val="clear" w:color="auto" w:fill="F7FBFF"/>
+          </w:tcPr>
+          <w:p>
+            <w:r/>
+            <w:r>
+              <w:rPr>
+                <w:rFonts w:ascii="Arial" w:hAnsi="Arial"/>
+                <w:b w:val="0"/>
+                <w:sz w:val="18"/>
+              </w:rPr>
+              <w:t>24</w:t>
+            </w:r>
+          </w:p>
+        </w:tc>
+        <w:tc>
+          <w:tcPr>
+            <w:tcW w:type="dxa" w:w="3376"/>
+            <w:shd w:val="clear" w:color="auto" w:fill="F7FBFF"/>
+          </w:tcPr>
+          <w:p>
+            <w:r/>
+            <w:r>
+              <w:rPr>
+                <w:rFonts w:ascii="Arial" w:hAnsi="Arial"/>
+                <w:b w:val="0"/>
+                <w:sz w:val="18"/>
+              </w:rPr>
+              <w:t>+5 por nivel de "Daño base"</w:t>
+            </w:r>
+          </w:p>
+        </w:tc>
+      </w:tr>
+      <w:tr>
+        <w:tc>
+          <w:tcPr>
+            <w:tcW w:type="dxa" w:w="2520"/>
+            <w:shd w:val="clear" w:color="auto" w:fill="FFFFFF"/>
+          </w:tcPr>
+          <w:p>
+            <w:r/>
+            <w:r>
+              <w:rPr>
+                <w:rFonts w:ascii="Arial" w:hAnsi="Arial"/>
+                <w:b/>
+                <w:sz w:val="18"/>
+              </w:rPr>
+              <w:t>Cooldown de disparo</w:t>
+            </w:r>
+          </w:p>
+        </w:tc>
+        <w:tc>
+          <w:tcPr>
+            <w:tcW w:type="dxa" w:w="3465"/>
+            <w:shd w:val="clear" w:color="auto" w:fill="FFFFFF"/>
+          </w:tcPr>
+          <w:p>
+            <w:r/>
+            <w:r>
+              <w:rPr>
+                <w:rFonts w:ascii="Arial" w:hAnsi="Arial"/>
+                <w:b w:val="0"/>
+                <w:sz w:val="18"/>
+              </w:rPr>
+              <w:t>310 ms (~3.2 disparos/seg)</w:t>
+            </w:r>
+          </w:p>
+        </w:tc>
+        <w:tc>
+          <w:tcPr>
+            <w:tcW w:type="dxa" w:w="3376"/>
+            <w:shd w:val="clear" w:color="auto" w:fill="FFFFFF"/>
+          </w:tcPr>
+          <w:p>
+            <w:r/>
+            <w:r>
+              <w:rPr>
+                <w:rFonts w:ascii="Arial" w:hAnsi="Arial"/>
+                <w:b w:val="0"/>
+                <w:sz w:val="18"/>
+              </w:rPr>
+              <w:t>-33% con habilidad "Disparo rápido" (~207 ms)</w:t>
+            </w:r>
+          </w:p>
+        </w:tc>
+      </w:tr>
+      <w:tr>
+        <w:tc>
+          <w:tcPr>
+            <w:tcW w:type="dxa" w:w="2520"/>
+            <w:shd w:val="clear" w:color="auto" w:fill="F7FBFF"/>
+          </w:tcPr>
+          <w:p>
+            <w:r/>
+            <w:r>
+              <w:rPr>
+                <w:rFonts w:ascii="Arial" w:hAnsi="Arial"/>
+                <w:b/>
+                <w:sz w:val="18"/>
+              </w:rPr>
+              <w:t>Reducción de armadura</w:t>
+            </w:r>
+          </w:p>
+        </w:tc>
+        <w:tc>
+          <w:tcPr>
+            <w:tcW w:type="dxa" w:w="3465"/>
+            <w:shd w:val="clear" w:color="auto" w:fill="F7FBFF"/>
+          </w:tcPr>
+          <w:p>
+            <w:r/>
+            <w:r>
+              <w:rPr>
+                <w:rFonts w:ascii="Arial" w:hAnsi="Arial"/>
+                <w:b w:val="0"/>
+                <w:sz w:val="18"/>
+              </w:rPr>
+              <w:t>0%</w:t>
+            </w:r>
+          </w:p>
+        </w:tc>
+        <w:tc>
+          <w:tcPr>
+            <w:tcW w:type="dxa" w:w="3376"/>
+            <w:shd w:val="clear" w:color="auto" w:fill="F7FBFF"/>
+          </w:tcPr>
+          <w:p>
+            <w:r/>
+            <w:r>
+              <w:rPr>
+                <w:rFonts w:ascii="Arial" w:hAnsi="Arial"/>
+                <w:b w:val="0"/>
+                <w:sz w:val="18"/>
+              </w:rPr>
+              <w:t>+5% por nivel, tope 65%</w:t>
+            </w:r>
+          </w:p>
+        </w:tc>
+      </w:tr>
+      <w:tr>
+        <w:tc>
+          <w:tcPr>
+            <w:tcW w:type="dxa" w:w="2520"/>
+            <w:shd w:val="clear" w:color="auto" w:fill="FFFFFF"/>
+          </w:tcPr>
+          <w:p>
+            <w:r/>
+            <w:r>
+              <w:rPr>
+                <w:rFonts w:ascii="Arial" w:hAnsi="Arial"/>
+                <w:b/>
+                <w:sz w:val="18"/>
+              </w:rPr>
+              <w:t>Multiplicador de monedas (suerte)</w:t>
+            </w:r>
+          </w:p>
+        </w:tc>
+        <w:tc>
+          <w:tcPr>
+            <w:tcW w:type="dxa" w:w="3465"/>
+            <w:shd w:val="clear" w:color="auto" w:fill="FFFFFF"/>
+          </w:tcPr>
+          <w:p>
+            <w:r/>
+            <w:r>
+              <w:rPr>
+                <w:rFonts w:ascii="Arial" w:hAnsi="Arial"/>
+                <w:b w:val="0"/>
+                <w:sz w:val="18"/>
+              </w:rPr>
+              <w:t>x1.0</w:t>
+            </w:r>
+          </w:p>
+        </w:tc>
+        <w:tc>
+          <w:tcPr>
+            <w:tcW w:type="dxa" w:w="3376"/>
+            <w:shd w:val="clear" w:color="auto" w:fill="FFFFFF"/>
+          </w:tcPr>
+          <w:p>
+            <w:r/>
+            <w:r>
+              <w:rPr>
+                <w:rFonts w:ascii="Arial" w:hAnsi="Arial"/>
+                <w:b w:val="0"/>
+                <w:sz w:val="18"/>
+              </w:rPr>
+              <w:t>+15% por nivel</w:t>
+            </w:r>
+          </w:p>
+        </w:tc>
+      </w:tr>
+      <w:tr>
+        <w:tc>
+          <w:tcPr>
+            <w:tcW w:type="dxa" w:w="2520"/>
+            <w:shd w:val="clear" w:color="auto" w:fill="F7FBFF"/>
+          </w:tcPr>
+          <w:p>
+            <w:r/>
+            <w:r>
+              <w:rPr>
+                <w:rFonts w:ascii="Arial" w:hAnsi="Arial"/>
+                <w:b/>
+                <w:sz w:val="18"/>
+              </w:rPr>
+              <w:t>Velocidad de flecha / alcance</w:t>
+            </w:r>
+          </w:p>
+        </w:tc>
+        <w:tc>
+          <w:tcPr>
+            <w:tcW w:type="dxa" w:w="3465"/>
+            <w:shd w:val="clear" w:color="auto" w:fill="F7FBFF"/>
+          </w:tcPr>
+          <w:p>
+            <w:r/>
+            <w:r>
+              <w:rPr>
+                <w:rFonts w:ascii="Arial" w:hAnsi="Arial"/>
+                <w:b w:val="0"/>
+                <w:sz w:val="18"/>
+              </w:rPr>
+              <w:t>500 px/s, vida útil 1050 ms (~525 px de alcance)</w:t>
+            </w:r>
+          </w:p>
+        </w:tc>
+        <w:tc>
+          <w:tcPr>
+            <w:tcW w:type="dxa" w:w="3376"/>
+            <w:shd w:val="clear" w:color="auto" w:fill="F7FBFF"/>
+          </w:tcPr>
+          <w:p>
+            <w:r/>
+            <w:r>
+              <w:rPr>
+                <w:rFonts w:ascii="Arial" w:hAnsi="Arial"/>
+                <w:b w:val="0"/>
+                <w:sz w:val="18"/>
+              </w:rPr>
+              <w:t>1450 ms de vida útil con "Flecha bumerán"</w:t>
+            </w:r>
+          </w:p>
+        </w:tc>
+      </w:tr>
+      <w:tr>
+        <w:tc>
+          <w:tcPr>
+            <w:tcW w:type="dxa" w:w="2520"/>
+            <w:shd w:val="clear" w:color="auto" w:fill="FFFFFF"/>
+          </w:tcPr>
+          <w:p>
+            <w:r/>
+            <w:r>
+              <w:rPr>
+                <w:rFonts w:ascii="Arial" w:hAnsi="Arial"/>
+                <w:b/>
+                <w:sz w:val="18"/>
+              </w:rPr>
+              <w:t>Invulnerabilidad tras recibir daño</w:t>
+            </w:r>
+          </w:p>
+        </w:tc>
+        <w:tc>
+          <w:tcPr>
+            <w:tcW w:type="dxa" w:w="3465"/>
+            <w:shd w:val="clear" w:color="auto" w:fill="FFFFFF"/>
+          </w:tcPr>
+          <w:p>
+            <w:r/>
+            <w:r>
+              <w:rPr>
+                <w:rFonts w:ascii="Arial" w:hAnsi="Arial"/>
+                <w:b w:val="0"/>
+                <w:sz w:val="18"/>
+              </w:rPr>
+              <w:t>650 ms</w:t>
+            </w:r>
+          </w:p>
+        </w:tc>
+        <w:tc>
+          <w:tcPr>
+            <w:tcW w:type="dxa" w:w="3376"/>
+            <w:shd w:val="clear" w:color="auto" w:fill="FFFFFF"/>
+          </w:tcPr>
+          <w:p>
+            <w:r/>
+            <w:r>
+              <w:rPr>
+                <w:rFonts w:ascii="Arial" w:hAnsi="Arial"/>
+                <w:b w:val="0"/>
+                <w:sz w:val="18"/>
+              </w:rPr>
+              <w:t>No mejorable</w:t>
+            </w:r>
+          </w:p>
+        </w:tc>
+      </w:tr>
+    </w:tbl>
+    <w:p/>
+    <w:p>
+      <w:pPr>
+        <w:pStyle w:val="Heading2"/>
+      </w:pPr>
+      <w:r>
+        <w:rPr>
+          <w:rFonts w:ascii="Arial" w:hAnsi="Arial"/>
+          <w:b/>
+          <w:color w:val="2E75B6"/>
+          <w:sz w:val="26"/>
+        </w:rPr>
+        <w:t>Stats de enemigos implementados</w:t>
+      </w:r>
+    </w:p>
+    <w:tbl>
+      <w:tblPr>
+        <w:tblW w:type="auto" w:w="0"/>
+        <w:tblLayout w:type="fixed"/>
+        <w:tblLook w:firstColumn="1" w:firstRow="1" w:lastColumn="0" w:lastRow="0" w:noHBand="0" w:noVBand="1" w:val="04A0"/>
+        <w:tblBorders>
+          <w:top w:val="single" w:color="auto" w:sz="4"/>
+          <w:left w:val="single" w:color="auto" w:sz="4"/>
+          <w:bottom w:val="single" w:color="auto" w:sz="4"/>
+          <w:right w:val="single" w:color="auto" w:sz="4"/>
+          <w:insideH w:val="single" w:color="auto" w:sz="4"/>
+          <w:insideV w:val="single" w:color="auto" w:sz="4"/>
+        </w:tblBorders>
+      </w:tblPr>
+      <w:tblGrid>
+        <w:gridCol w:w="1289"/>
+        <w:gridCol w:w="1289"/>
+        <w:gridCol w:w="1289"/>
+        <w:gridCol w:w="1289"/>
+        <w:gridCol w:w="1289"/>
+        <w:gridCol w:w="1289"/>
+        <w:gridCol w:w="1289"/>
+      </w:tblGrid>
+      <w:tr>
+        <w:tc>
+          <w:tcPr>
+            <w:tcW w:type="dxa" w:w="1732"/>
+            <w:shd w:val="clear" w:color="auto" w:fill="2E75B6"/>
+          </w:tcPr>
+          <w:p>
+            <w:r/>
+            <w:r>
+              <w:rPr>
+                <w:rFonts w:ascii="Arial" w:hAnsi="Arial"/>
+                <w:b/>
+                <w:color w:val="FFFFFF"/>
+                <w:sz w:val="16"/>
+              </w:rPr>
+              <w:t>Enemigo</w:t>
+            </w:r>
+          </w:p>
+        </w:tc>
+        <w:tc>
+          <w:tcPr>
+            <w:tcW w:type="dxa" w:w="1102"/>
+            <w:shd w:val="clear" w:color="auto" w:fill="2E75B6"/>
+          </w:tcPr>
+          <w:p>
+            <w:r/>
+            <w:r>
+              <w:rPr>
+                <w:rFonts w:ascii="Arial" w:hAnsi="Arial"/>
+                <w:b/>
+                <w:color w:val="FFFFFF"/>
+                <w:sz w:val="16"/>
+              </w:rPr>
+              <w:t>HP</w:t>
+            </w:r>
+          </w:p>
+        </w:tc>
+        <w:tc>
+          <w:tcPr>
+            <w:tcW w:type="dxa" w:w="1969"/>
+            <w:shd w:val="clear" w:color="auto" w:fill="2E75B6"/>
+          </w:tcPr>
+          <w:p>
+            <w:r/>
+            <w:r>
+              <w:rPr>
+                <w:rFonts w:ascii="Arial" w:hAnsi="Arial"/>
+                <w:b/>
+                <w:color w:val="FFFFFF"/>
+                <w:sz w:val="16"/>
+              </w:rPr>
+              <w:t>Velocidad</w:t>
+            </w:r>
+          </w:p>
+        </w:tc>
+        <w:tc>
+          <w:tcPr>
+            <w:tcW w:type="dxa" w:w="1417"/>
+            <w:shd w:val="clear" w:color="auto" w:fill="2E75B6"/>
+          </w:tcPr>
+          <w:p>
+            <w:r/>
+            <w:r>
+              <w:rPr>
+                <w:rFonts w:ascii="Arial" w:hAnsi="Arial"/>
+                <w:b/>
+                <w:color w:val="FFFFFF"/>
+                <w:sz w:val="16"/>
+              </w:rPr>
+              <w:t>Daño contacto</w:t>
+            </w:r>
+          </w:p>
+        </w:tc>
+        <w:tc>
+          <w:tcPr>
+            <w:tcW w:type="dxa" w:w="1417"/>
+            <w:shd w:val="clear" w:color="auto" w:fill="2E75B6"/>
+          </w:tcPr>
+          <w:p>
+            <w:r/>
+            <w:r>
+              <w:rPr>
+                <w:rFonts w:ascii="Arial" w:hAnsi="Arial"/>
+                <w:b/>
+                <w:color w:val="FFFFFF"/>
+                <w:sz w:val="16"/>
+              </w:rPr>
+              <w:t>Daño a distancia</w:t>
+            </w:r>
+          </w:p>
+        </w:tc>
+        <w:tc>
+          <w:tcPr>
+            <w:tcW w:type="dxa" w:w="866"/>
+            <w:shd w:val="clear" w:color="auto" w:fill="2E75B6"/>
+          </w:tcPr>
+          <w:p>
+            <w:r/>
+            <w:r>
+              <w:rPr>
+                <w:rFonts w:ascii="Arial" w:hAnsi="Arial"/>
+                <w:b/>
+                <w:color w:val="FFFFFF"/>
+                <w:sz w:val="16"/>
+              </w:rPr>
+              <w:t>Monedas</w:t>
+            </w:r>
+          </w:p>
+        </w:tc>
+        <w:tc>
+          <w:tcPr>
+            <w:tcW w:type="dxa" w:w="856"/>
+            <w:shd w:val="clear" w:color="auto" w:fill="2E75B6"/>
+          </w:tcPr>
+          <w:p>
+            <w:r/>
+            <w:r>
+              <w:rPr>
+                <w:rFonts w:ascii="Arial" w:hAnsi="Arial"/>
+                <w:b/>
+                <w:color w:val="FFFFFF"/>
+                <w:sz w:val="16"/>
+              </w:rPr>
+              <w:t>Score</w:t>
+            </w:r>
+          </w:p>
+        </w:tc>
+      </w:tr>
+      <w:tr>
+        <w:tc>
+          <w:tcPr>
+            <w:tcW w:type="dxa" w:w="1732"/>
+            <w:shd w:val="clear" w:color="auto" w:fill="F7FBFF"/>
+          </w:tcPr>
+          <w:p>
+            <w:r/>
+            <w:r>
+              <w:rPr>
+                <w:rFonts w:ascii="Arial" w:hAnsi="Arial"/>
+                <w:b/>
+                <w:sz w:val="16"/>
+              </w:rPr>
+              <w:t>Araña de arena</w:t>
+            </w:r>
+          </w:p>
+        </w:tc>
+        <w:tc>
+          <w:tcPr>
+            <w:tcW w:type="dxa" w:w="1102"/>
+            <w:shd w:val="clear" w:color="auto" w:fill="F7FBFF"/>
+          </w:tcPr>
+          <w:p>
+            <w:r/>
+            <w:r>
+              <w:rPr>
+                <w:rFonts w:ascii="Arial" w:hAnsi="Arial"/>
+                <w:b w:val="0"/>
+                <w:sz w:val="16"/>
+              </w:rPr>
+              <w:t>35</w:t>
+            </w:r>
+          </w:p>
+        </w:tc>
+        <w:tc>
+          <w:tcPr>
+            <w:tcW w:type="dxa" w:w="1969"/>
+            <w:shd w:val="clear" w:color="auto" w:fill="F7FBFF"/>
+          </w:tcPr>
+          <w:p>
+            <w:r/>
+            <w:r>
+              <w:rPr>
+                <w:rFonts w:ascii="Arial" w:hAnsi="Arial"/>
+                <w:b w:val="0"/>
+                <w:sz w:val="16"/>
+              </w:rPr>
+              <w:t>95 px/s (zigzag)</w:t>
+            </w:r>
+          </w:p>
+        </w:tc>
+        <w:tc>
+          <w:tcPr>
+            <w:tcW w:type="dxa" w:w="1417"/>
+            <w:shd w:val="clear" w:color="auto" w:fill="F7FBFF"/>
+          </w:tcPr>
+          <w:p>
+            <w:r/>
+            <w:r>
+              <w:rPr>
+                <w:rFonts w:ascii="Arial" w:hAnsi="Arial"/>
+                <w:b w:val="0"/>
+                <w:sz w:val="16"/>
+              </w:rPr>
+              <w:t>8</w:t>
+            </w:r>
+          </w:p>
+        </w:tc>
+        <w:tc>
+          <w:tcPr>
+            <w:tcW w:type="dxa" w:w="1417"/>
+            <w:shd w:val="clear" w:color="auto" w:fill="F7FBFF"/>
+          </w:tcPr>
+          <w:p>
+            <w:r/>
+            <w:r>
+              <w:rPr>
+                <w:rFonts w:ascii="Arial" w:hAnsi="Arial"/>
+                <w:b w:val="0"/>
+                <w:sz w:val="16"/>
+              </w:rPr>
+              <w:t>—</w:t>
+            </w:r>
+          </w:p>
+        </w:tc>
+        <w:tc>
+          <w:tcPr>
+            <w:tcW w:type="dxa" w:w="866"/>
+            <w:shd w:val="clear" w:color="auto" w:fill="F7FBFF"/>
+          </w:tcPr>
+          <w:p>
+            <w:r/>
+            <w:r>
+              <w:rPr>
+                <w:rFonts w:ascii="Arial" w:hAnsi="Arial"/>
+                <w:b w:val="0"/>
+                <w:sz w:val="16"/>
+              </w:rPr>
+              <w:t>1 (x suerte)</w:t>
+            </w:r>
+          </w:p>
+        </w:tc>
+        <w:tc>
+          <w:tcPr>
+            <w:tcW w:type="dxa" w:w="856"/>
+            <w:shd w:val="clear" w:color="auto" w:fill="F7FBFF"/>
+          </w:tcPr>
+          <w:p>
+            <w:r/>
+            <w:r>
+              <w:rPr>
+                <w:rFonts w:ascii="Arial" w:hAnsi="Arial"/>
+                <w:b w:val="0"/>
+                <w:sz w:val="16"/>
+              </w:rPr>
+              <w:t>10</w:t>
+            </w:r>
+          </w:p>
+        </w:tc>
+      </w:tr>
+      <w:tr>
+        <w:tc>
+          <w:tcPr>
+            <w:tcW w:type="dxa" w:w="1732"/>
+            <w:shd w:val="clear" w:color="auto" w:fill="FFFFFF"/>
+          </w:tcPr>
+          <w:p>
+            <w:r/>
+            <w:r>
+              <w:rPr>
+                <w:rFonts w:ascii="Arial" w:hAnsi="Arial"/>
+                <w:b/>
+                <w:sz w:val="16"/>
+              </w:rPr>
+              <w:t>Escorpión centinela</w:t>
+            </w:r>
+          </w:p>
+        </w:tc>
+        <w:tc>
+          <w:tcPr>
+            <w:tcW w:type="dxa" w:w="1102"/>
+            <w:shd w:val="clear" w:color="auto" w:fill="FFFFFF"/>
+          </w:tcPr>
+          <w:p>
+            <w:r/>
+            <w:r>
+              <w:rPr>
+                <w:rFonts w:ascii="Arial" w:hAnsi="Arial"/>
+                <w:b w:val="0"/>
+                <w:sz w:val="16"/>
+              </w:rPr>
+              <w:t>55</w:t>
+            </w:r>
+          </w:p>
+        </w:tc>
+        <w:tc>
+          <w:tcPr>
+            <w:tcW w:type="dxa" w:w="1969"/>
+            <w:shd w:val="clear" w:color="auto" w:fill="FFFFFF"/>
+          </w:tcPr>
+          <w:p>
+            <w:r/>
+            <w:r>
+              <w:rPr>
+                <w:rFonts w:ascii="Arial" w:hAnsi="Arial"/>
+                <w:b w:val="0"/>
+                <w:sz w:val="16"/>
+              </w:rPr>
+              <w:t>38.5 px/s (acecho) / quieto en rango</w:t>
+            </w:r>
+          </w:p>
+        </w:tc>
+        <w:tc>
+          <w:tcPr>
+            <w:tcW w:type="dxa" w:w="1417"/>
+            <w:shd w:val="clear" w:color="auto" w:fill="FFFFFF"/>
+          </w:tcPr>
+          <w:p>
+            <w:r/>
+            <w:r>
+              <w:rPr>
+                <w:rFonts w:ascii="Arial" w:hAnsi="Arial"/>
+                <w:b w:val="0"/>
+                <w:sz w:val="16"/>
+              </w:rPr>
+              <w:t>10</w:t>
+            </w:r>
+          </w:p>
+        </w:tc>
+        <w:tc>
+          <w:tcPr>
+            <w:tcW w:type="dxa" w:w="1417"/>
+            <w:shd w:val="clear" w:color="auto" w:fill="FFFFFF"/>
+          </w:tcPr>
+          <w:p>
+            <w:r/>
+            <w:r>
+              <w:rPr>
+                <w:rFonts w:ascii="Arial" w:hAnsi="Arial"/>
+                <w:b w:val="0"/>
+                <w:sz w:val="16"/>
+              </w:rPr>
+              <w:t>11 c/ ~1.45s</w:t>
+            </w:r>
+          </w:p>
+        </w:tc>
+        <w:tc>
+          <w:tcPr>
+            <w:tcW w:type="dxa" w:w="866"/>
+            <w:shd w:val="clear" w:color="auto" w:fill="FFFFFF"/>
+          </w:tcPr>
+          <w:p>
+            <w:r/>
+            <w:r>
+              <w:rPr>
+                <w:rFonts w:ascii="Arial" w:hAnsi="Arial"/>
+                <w:b w:val="0"/>
+                <w:sz w:val="16"/>
+              </w:rPr>
+              <w:t>2 (x suerte)</w:t>
+            </w:r>
+          </w:p>
+        </w:tc>
+        <w:tc>
+          <w:tcPr>
+            <w:tcW w:type="dxa" w:w="856"/>
+            <w:shd w:val="clear" w:color="auto" w:fill="FFFFFF"/>
+          </w:tcPr>
+          <w:p>
+            <w:r/>
+            <w:r>
+              <w:rPr>
+                <w:rFonts w:ascii="Arial" w:hAnsi="Arial"/>
+                <w:b w:val="0"/>
+                <w:sz w:val="16"/>
+              </w:rPr>
+              <w:t>18</w:t>
+            </w:r>
+          </w:p>
+        </w:tc>
+      </w:tr>
+      <w:tr>
+        <w:tc>
+          <w:tcPr>
+            <w:tcW w:type="dxa" w:w="1732"/>
+            <w:shd w:val="clear" w:color="auto" w:fill="F7FBFF"/>
+          </w:tcPr>
+          <w:p>
+            <w:r/>
+            <w:r>
+              <w:rPr>
+                <w:rFonts w:ascii="Arial" w:hAnsi="Arial"/>
+                <w:b/>
+                <w:sz w:val="16"/>
+              </w:rPr>
+              <w:t>Momia errante</w:t>
+            </w:r>
+          </w:p>
+        </w:tc>
+        <w:tc>
+          <w:tcPr>
+            <w:tcW w:type="dxa" w:w="1102"/>
+            <w:shd w:val="clear" w:color="auto" w:fill="F7FBFF"/>
+          </w:tcPr>
+          <w:p>
+            <w:r/>
+            <w:r>
+              <w:rPr>
+                <w:rFonts w:ascii="Arial" w:hAnsi="Arial"/>
+                <w:b w:val="0"/>
+                <w:sz w:val="16"/>
+              </w:rPr>
+              <w:t>80</w:t>
+            </w:r>
+          </w:p>
+        </w:tc>
+        <w:tc>
+          <w:tcPr>
+            <w:tcW w:type="dxa" w:w="1969"/>
+            <w:shd w:val="clear" w:color="auto" w:fill="F7FBFF"/>
+          </w:tcPr>
+          <w:p>
+            <w:r/>
+            <w:r>
+              <w:rPr>
+                <w:rFonts w:ascii="Arial" w:hAnsi="Arial"/>
+                <w:b w:val="0"/>
+                <w:sz w:val="16"/>
+              </w:rPr>
+              <w:t>45.5 px/s</w:t>
+            </w:r>
+          </w:p>
+        </w:tc>
+        <w:tc>
+          <w:tcPr>
+            <w:tcW w:type="dxa" w:w="1417"/>
+            <w:shd w:val="clear" w:color="auto" w:fill="F7FBFF"/>
+          </w:tcPr>
+          <w:p>
+            <w:r/>
+            <w:r>
+              <w:rPr>
+                <w:rFonts w:ascii="Arial" w:hAnsi="Arial"/>
+                <w:b w:val="0"/>
+                <w:sz w:val="16"/>
+              </w:rPr>
+              <w:t>12 + maldición (-45% vel. jugador, 2s)</w:t>
+            </w:r>
+          </w:p>
+        </w:tc>
+        <w:tc>
+          <w:tcPr>
+            <w:tcW w:type="dxa" w:w="1417"/>
+            <w:shd w:val="clear" w:color="auto" w:fill="F7FBFF"/>
+          </w:tcPr>
+          <w:p>
+            <w:r/>
+            <w:r>
+              <w:rPr>
+                <w:rFonts w:ascii="Arial" w:hAnsi="Arial"/>
+                <w:b w:val="0"/>
+                <w:sz w:val="16"/>
+              </w:rPr>
+              <w:t>—</w:t>
+            </w:r>
+          </w:p>
+        </w:tc>
+        <w:tc>
+          <w:tcPr>
+            <w:tcW w:type="dxa" w:w="866"/>
+            <w:shd w:val="clear" w:color="auto" w:fill="F7FBFF"/>
+          </w:tcPr>
+          <w:p>
+            <w:r/>
+            <w:r>
+              <w:rPr>
+                <w:rFonts w:ascii="Arial" w:hAnsi="Arial"/>
+                <w:b w:val="0"/>
+                <w:sz w:val="16"/>
+              </w:rPr>
+              <w:t>2 (x suerte)</w:t>
+            </w:r>
+          </w:p>
+        </w:tc>
+        <w:tc>
+          <w:tcPr>
+            <w:tcW w:type="dxa" w:w="856"/>
+            <w:shd w:val="clear" w:color="auto" w:fill="F7FBFF"/>
+          </w:tcPr>
+          <w:p>
+            <w:r/>
+            <w:r>
+              <w:rPr>
+                <w:rFonts w:ascii="Arial" w:hAnsi="Arial"/>
+                <w:b w:val="0"/>
+                <w:sz w:val="16"/>
+              </w:rPr>
+              <w:t>22</w:t>
+            </w:r>
+          </w:p>
+        </w:tc>
+      </w:tr>
+      <w:tr>
+        <w:tc>
+          <w:tcPr>
+            <w:tcW w:type="dxa" w:w="1732"/>
+            <w:shd w:val="clear" w:color="auto" w:fill="FFFFFF"/>
+          </w:tcPr>
+          <w:p>
+            <w:r/>
+            <w:r>
+              <w:rPr>
+                <w:rFonts w:ascii="Arial" w:hAnsi="Arial"/>
+                <w:b/>
+                <w:sz w:val="16"/>
+              </w:rPr>
+              <w:t>Serpiente voladora</w:t>
+            </w:r>
+          </w:p>
+        </w:tc>
+        <w:tc>
+          <w:tcPr>
+            <w:tcW w:type="dxa" w:w="1102"/>
+            <w:shd w:val="clear" w:color="auto" w:fill="FFFFFF"/>
+          </w:tcPr>
+          <w:p>
+            <w:r/>
+            <w:r>
+              <w:rPr>
+                <w:rFonts w:ascii="Arial" w:hAnsi="Arial"/>
+                <w:b w:val="0"/>
+                <w:sz w:val="16"/>
+              </w:rPr>
+              <w:t>62</w:t>
+            </w:r>
+          </w:p>
+        </w:tc>
+        <w:tc>
+          <w:tcPr>
+            <w:tcW w:type="dxa" w:w="1969"/>
+            <w:shd w:val="clear" w:color="auto" w:fill="FFFFFF"/>
+          </w:tcPr>
+          <w:p>
+            <w:r/>
+            <w:r>
+              <w:rPr>
+                <w:rFonts w:ascii="Arial" w:hAnsi="Arial"/>
+                <w:b w:val="0"/>
+                <w:sz w:val="16"/>
+              </w:rPr>
+              <w:t>84 px/s (orbital)</w:t>
+            </w:r>
+          </w:p>
+        </w:tc>
+        <w:tc>
+          <w:tcPr>
+            <w:tcW w:type="dxa" w:w="1417"/>
+            <w:shd w:val="clear" w:color="auto" w:fill="FFFFFF"/>
+          </w:tcPr>
+          <w:p>
+            <w:r/>
+            <w:r>
+              <w:rPr>
+                <w:rFonts w:ascii="Arial" w:hAnsi="Arial"/>
+                <w:b w:val="0"/>
+                <w:sz w:val="16"/>
+              </w:rPr>
+              <w:t>10</w:t>
+            </w:r>
+          </w:p>
+        </w:tc>
+        <w:tc>
+          <w:tcPr>
+            <w:tcW w:type="dxa" w:w="1417"/>
+            <w:shd w:val="clear" w:color="auto" w:fill="FFFFFF"/>
+          </w:tcPr>
+          <w:p>
+            <w:r/>
+            <w:r>
+              <w:rPr>
+                <w:rFonts w:ascii="Arial" w:hAnsi="Arial"/>
+                <w:b w:val="0"/>
+                <w:sz w:val="16"/>
+              </w:rPr>
+              <w:t>13 c/ ~1.65s (veneno)</w:t>
+            </w:r>
+          </w:p>
+        </w:tc>
+        <w:tc>
+          <w:tcPr>
+            <w:tcW w:type="dxa" w:w="866"/>
+            <w:shd w:val="clear" w:color="auto" w:fill="FFFFFF"/>
+          </w:tcPr>
+          <w:p>
+            <w:r/>
+            <w:r>
+              <w:rPr>
+                <w:rFonts w:ascii="Arial" w:hAnsi="Arial"/>
+                <w:b w:val="0"/>
+                <w:sz w:val="16"/>
+              </w:rPr>
+              <w:t>2 (x suerte)</w:t>
+            </w:r>
+          </w:p>
+        </w:tc>
+        <w:tc>
+          <w:tcPr>
+            <w:tcW w:type="dxa" w:w="856"/>
+            <w:shd w:val="clear" w:color="auto" w:fill="FFFFFF"/>
+          </w:tcPr>
+          <w:p>
+            <w:r/>
+            <w:r>
+              <w:rPr>
+                <w:rFonts w:ascii="Arial" w:hAnsi="Arial"/>
+                <w:b w:val="0"/>
+                <w:sz w:val="16"/>
+              </w:rPr>
+              <w:t>26</w:t>
+            </w:r>
+          </w:p>
+        </w:tc>
+      </w:tr>
+    </w:tbl>
+    <w:p/>
+    <w:p>
+      <w:pPr>
+        <w:pStyle w:val="Heading2"/>
+      </w:pPr>
+      <w:r>
+        <w:rPr>
+          <w:rFonts w:ascii="Arial" w:hAnsi="Arial"/>
+          <w:b/>
+          <w:color w:val="2E75B6"/>
+          <w:sz w:val="26"/>
+        </w:rPr>
+        <w:t>Enemigos diseñados, no implementados en código</w:t>
+      </w:r>
+    </w:p>
+    <w:tbl>
+      <w:tblPr>
+        <w:tblW w:type="auto" w:w="0"/>
+        <w:tblLayout w:type="fixed"/>
+        <w:tblLook w:firstColumn="1" w:firstRow="1" w:lastColumn="0" w:lastRow="0" w:noHBand="0" w:noVBand="1" w:val="04A0"/>
+        <w:tblBorders>
+          <w:top w:val="single" w:color="auto" w:sz="4"/>
+          <w:left w:val="single" w:color="auto" w:sz="4"/>
+          <w:bottom w:val="single" w:color="auto" w:sz="4"/>
+          <w:right w:val="single" w:color="auto" w:sz="4"/>
+          <w:insideH w:val="single" w:color="auto" w:sz="4"/>
+          <w:insideV w:val="single" w:color="auto" w:sz="4"/>
+        </w:tblBorders>
+      </w:tblPr>
+      <w:tblGrid>
+        <w:gridCol w:w="4513"/>
+        <w:gridCol w:w="4513"/>
+      </w:tblGrid>
+      <w:tr>
+        <w:tc>
+          <w:tcPr>
+            <w:tcW w:type="dxa" w:w="2800"/>
+            <w:shd w:val="clear" w:color="auto" w:fill="2E75B6"/>
+          </w:tcPr>
+          <w:p>
+            <w:r/>
+            <w:r>
+              <w:rPr>
+                <w:rFonts w:ascii="Arial" w:hAnsi="Arial"/>
+                <w:b/>
+                <w:color w:val="FFFFFF"/>
+                <w:sz w:val="18"/>
+              </w:rPr>
+              <w:t>Enemigo</w:t>
+            </w:r>
+          </w:p>
+        </w:tc>
+        <w:tc>
+          <w:tcPr>
+            <w:tcW w:type="dxa" w:w="6560"/>
+            <w:shd w:val="clear" w:color="auto" w:fill="2E75B6"/>
+          </w:tcPr>
+          <w:p>
+            <w:r/>
+            <w:r>
+              <w:rPr>
+                <w:rFonts w:ascii="Arial" w:hAnsi="Arial"/>
+                <w:b/>
+                <w:color w:val="FFFFFF"/>
+                <w:sz w:val="18"/>
+              </w:rPr>
+              <w:t>Motivo</w:t>
+            </w:r>
+          </w:p>
+        </w:tc>
+      </w:tr>
+      <w:tr>
+        <w:tc>
+          <w:tcPr>
+            <w:tcW w:type="dxa" w:w="2800"/>
+            <w:shd w:val="clear" w:color="auto" w:fill="F7FBFF"/>
+          </w:tcPr>
+          <w:p>
+            <w:r/>
+            <w:r>
+              <w:rPr>
+                <w:rFonts w:ascii="Arial" w:hAnsi="Arial"/>
+                <w:b/>
+                <w:sz w:val="18"/>
+              </w:rPr>
+              <w:t>Guardián de piedra</w:t>
+            </w:r>
+          </w:p>
+        </w:tc>
+        <w:tc>
+          <w:tcPr>
+            <w:tcW w:type="dxa" w:w="6560"/>
+            <w:shd w:val="clear" w:color="auto" w:fill="F7FBFF"/>
+          </w:tcPr>
+          <w:p>
+            <w:r/>
+            <w:r>
+              <w:rPr>
+                <w:rFonts w:ascii="Arial" w:hAnsi="Arial"/>
+                <w:b w:val="0"/>
+                <w:sz w:val="18"/>
+              </w:rPr>
+              <w:t>Requiere mecánica de escudo direccional que no existe en BaseLevelScene.js</w:t>
+            </w:r>
+          </w:p>
+        </w:tc>
+      </w:tr>
+      <w:tr>
+        <w:tc>
+          <w:tcPr>
+            <w:tcW w:type="dxa" w:w="2800"/>
+            <w:shd w:val="clear" w:color="auto" w:fill="FFFFFF"/>
+          </w:tcPr>
+          <w:p>
+            <w:r/>
+            <w:r>
+              <w:rPr>
+                <w:rFonts w:ascii="Arial" w:hAnsi="Arial"/>
+                <w:b/>
+                <w:sz w:val="18"/>
+              </w:rPr>
+              <w:t>Espíritu de arena</w:t>
+            </w:r>
+          </w:p>
+        </w:tc>
+        <w:tc>
+          <w:tcPr>
+            <w:tcW w:type="dxa" w:w="6560"/>
+            <w:shd w:val="clear" w:color="auto" w:fill="FFFFFF"/>
+          </w:tcPr>
+          <w:p>
+            <w:r/>
+            <w:r>
+              <w:rPr>
+                <w:rFonts w:ascii="Arial" w:hAnsi="Arial"/>
+                <w:b w:val="0"/>
+                <w:sz w:val="18"/>
+              </w:rPr>
+              <w:t>Ligado al Boss 1 (Coloso de Piedra), que tampoco tiene ninguna escena implementada</w:t>
+            </w:r>
+          </w:p>
+        </w:tc>
+      </w:tr>
+    </w:tbl>
+    <w:p/>
+    <w:p>
+      <w:pPr>
+        <w:pStyle w:val="Heading1"/>
+      </w:pPr>
+      <w:r>
+        <w:rPr>
+          <w:rFonts w:ascii="Arial" w:hAnsi="Arial"/>
+          <w:b/>
+          <w:color w:val="1F4E79"/>
+          <w:sz w:val="32"/>
+        </w:rPr>
+        <w:t>14. Estado de Implementación — MVP vs Visión Completa</w:t>
+      </w:r>
+    </w:p>
+    <w:p>
+      <w:r>
+        <w:rPr>
+          <w:rFonts w:ascii="Arial" w:hAnsi="Arial"/>
+          <w:b w:val="0"/>
+          <w:i/>
+          <w:color w:val="412402"/>
+          <w:sz w:val="26"/>
+        </w:rPr>
+        <w:t>Este documento describe la visión completa de The Monster Hunter: 10 niveles, 2 bosses y 6 tipos de enemigos. Lo que existe hoy, jugable y probado, es el MVP de la tabla siguiente. Esta sección existe para que el equipo, el docente y cualquier persona que abra el repositorio sepan con precisión qué está construido y qué es todavía diseño en papel — documentar esta diferencia es lo que evita que un GDD se convierta en ficción.</w:t>
+      </w:r>
+    </w:p>
+    <w:p/>
+    <w:tbl>
+      <w:tblPr>
+        <w:tblW w:type="auto" w:w="0"/>
+        <w:tblLayout w:type="fixed"/>
+        <w:tblLook w:firstColumn="1" w:firstRow="1" w:lastColumn="0" w:lastRow="0" w:noHBand="0" w:noVBand="1" w:val="04A0"/>
+        <w:tblBorders>
+          <w:top w:val="single" w:color="auto" w:sz="4"/>
+          <w:left w:val="single" w:color="auto" w:sz="4"/>
+          <w:bottom w:val="single" w:color="auto" w:sz="4"/>
+          <w:right w:val="single" w:color="auto" w:sz="4"/>
+          <w:insideH w:val="single" w:color="auto" w:sz="4"/>
+          <w:insideV w:val="single" w:color="auto" w:sz="4"/>
+        </w:tblBorders>
+      </w:tblPr>
+      <w:tblGrid>
+        <w:gridCol w:w="3009"/>
+        <w:gridCol w:w="3009"/>
+        <w:gridCol w:w="3009"/>
+      </w:tblGrid>
+      <w:tr>
+        <w:tc>
+          <w:tcPr>
+            <w:tcW w:type="dxa" w:w="2520"/>
+            <w:shd w:val="clear" w:color="auto" w:fill="1F4E79"/>
+          </w:tcPr>
+          <w:p>
+            <w:r/>
+            <w:r>
+              <w:rPr>
+                <w:rFonts w:ascii="Arial" w:hAnsi="Arial"/>
+                <w:b/>
+                <w:color w:val="FFFFFF"/>
+                <w:sz w:val="18"/>
+              </w:rPr>
+              <w:t>Elemento</w:t>
+            </w:r>
+          </w:p>
+        </w:tc>
+        <w:tc>
+          <w:tcPr>
+            <w:tcW w:type="dxa" w:w="2362"/>
+            <w:shd w:val="clear" w:color="auto" w:fill="1F4E79"/>
+          </w:tcPr>
+          <w:p>
+            <w:r/>
+            <w:r>
+              <w:rPr>
+                <w:rFonts w:ascii="Arial" w:hAnsi="Arial"/>
+                <w:b/>
+                <w:color w:val="FFFFFF"/>
+                <w:sz w:val="18"/>
+              </w:rPr>
+              <w:t>Estado</w:t>
+            </w:r>
+          </w:p>
+        </w:tc>
+        <w:tc>
+          <w:tcPr>
+            <w:tcW w:type="dxa" w:w="4478"/>
+            <w:shd w:val="clear" w:color="auto" w:fill="1F4E79"/>
+          </w:tcPr>
+          <w:p>
+            <w:r/>
+            <w:r>
+              <w:rPr>
+                <w:rFonts w:ascii="Arial" w:hAnsi="Arial"/>
+                <w:b/>
+                <w:color w:val="FFFFFF"/>
+                <w:sz w:val="18"/>
+              </w:rPr>
+              <w:t>Detalle</w:t>
+            </w:r>
+          </w:p>
+        </w:tc>
+      </w:tr>
+      <w:tr>
+        <w:tc>
+          <w:tcPr>
+            <w:tcW w:type="dxa" w:w="2520"/>
+            <w:shd w:val="clear" w:color="auto" w:fill="E2F0D9"/>
+          </w:tcPr>
+          <w:p>
+            <w:r/>
+            <w:r>
+              <w:rPr>
+                <w:rFonts w:ascii="Arial" w:hAnsi="Arial"/>
+                <w:b/>
+                <w:color w:val="1E6B2E"/>
+                <w:sz w:val="18"/>
+              </w:rPr>
+              <w:t>Nivel 1 — El paso de arena</w:t>
+            </w:r>
+          </w:p>
+        </w:tc>
+        <w:tc>
+          <w:tcPr>
+            <w:tcW w:type="dxa" w:w="2362"/>
+            <w:shd w:val="clear" w:color="auto" w:fill="E2F0D9"/>
+          </w:tcPr>
+          <w:p>
+            <w:r/>
+            <w:r>
+              <w:rPr>
+                <w:rFonts w:ascii="Arial" w:hAnsi="Arial"/>
+                <w:b w:val="0"/>
+                <w:color w:val="1E6B2E"/>
+                <w:sz w:val="18"/>
+              </w:rPr>
+              <w:t>Implementado</w:t>
+            </w:r>
+          </w:p>
+        </w:tc>
+        <w:tc>
+          <w:tcPr>
+            <w:tcW w:type="dxa" w:w="4478"/>
+            <w:shd w:val="clear" w:color="auto" w:fill="E2F0D9"/>
+          </w:tcPr>
+          <w:p>
+            <w:r/>
+            <w:r>
+              <w:rPr>
+                <w:rFonts w:ascii="Arial" w:hAnsi="Arial"/>
+                <w:b w:val="0"/>
+                <w:color w:val="1E6B2E"/>
+                <w:sz w:val="18"/>
+              </w:rPr>
+              <w:t>8 enemigos (5 arañas + 2 escorpiones + 1 aleatorio), 4 caches de monedas, portal en posición aleatoria, objetivo de 8 kills</w:t>
+            </w:r>
+          </w:p>
+        </w:tc>
+      </w:tr>
+      <w:tr>
+        <w:tc>
+          <w:tcPr>
+            <w:tcW w:type="dxa" w:w="2520"/>
+            <w:shd w:val="clear" w:color="auto" w:fill="E2F0D9"/>
+          </w:tcPr>
+          <w:p>
+            <w:r/>
+            <w:r>
+              <w:rPr>
+                <w:rFonts w:ascii="Arial" w:hAnsi="Arial"/>
+                <w:b/>
+                <w:color w:val="1E6B2E"/>
+                <w:sz w:val="18"/>
+              </w:rPr>
+              <w:t>Nivel 2 — Catacumbas ardientes</w:t>
+            </w:r>
+          </w:p>
+        </w:tc>
+        <w:tc>
+          <w:tcPr>
+            <w:tcW w:type="dxa" w:w="2362"/>
+            <w:shd w:val="clear" w:color="auto" w:fill="E2F0D9"/>
+          </w:tcPr>
+          <w:p>
+            <w:r/>
+            <w:r>
+              <w:rPr>
+                <w:rFonts w:ascii="Arial" w:hAnsi="Arial"/>
+                <w:b w:val="0"/>
+                <w:color w:val="1E6B2E"/>
+                <w:sz w:val="18"/>
+              </w:rPr>
+              <w:t>Implementado</w:t>
+            </w:r>
+          </w:p>
+        </w:tc>
+        <w:tc>
+          <w:tcPr>
+            <w:tcW w:type="dxa" w:w="4478"/>
+            <w:shd w:val="clear" w:color="auto" w:fill="E2F0D9"/>
+          </w:tcPr>
+          <w:p>
+            <w:r/>
+            <w:r>
+              <w:rPr>
+                <w:rFonts w:ascii="Arial" w:hAnsi="Arial"/>
+                <w:b w:val="0"/>
+                <w:color w:val="1E6B2E"/>
+                <w:sz w:val="18"/>
+              </w:rPr>
+              <w:t>3 oleadas cronometradas (momia/serpiente alternadas), lava con 8 HP de daño cada 500 ms, plataformas móviles, 9 kills requeridos</w:t>
+            </w:r>
+          </w:p>
+        </w:tc>
+      </w:tr>
+      <w:tr>
+        <w:tc>
+          <w:tcPr>
+            <w:tcW w:type="dxa" w:w="2520"/>
+            <w:shd w:val="clear" w:color="auto" w:fill="FDEBD0"/>
+          </w:tcPr>
+          <w:p>
+            <w:r/>
+            <w:r>
+              <w:rPr>
+                <w:rFonts w:ascii="Arial" w:hAnsi="Arial"/>
+                <w:b/>
+                <w:color w:val="9C4A00"/>
+                <w:sz w:val="18"/>
+              </w:rPr>
+              <w:t>Niveles 3–4</w:t>
+            </w:r>
+          </w:p>
+        </w:tc>
+        <w:tc>
+          <w:tcPr>
+            <w:tcW w:type="dxa" w:w="2362"/>
+            <w:shd w:val="clear" w:color="auto" w:fill="FDEBD0"/>
+          </w:tcPr>
+          <w:p>
+            <w:r/>
+            <w:r>
+              <w:rPr>
+                <w:rFonts w:ascii="Arial" w:hAnsi="Arial"/>
+                <w:b w:val="0"/>
+                <w:color w:val="9C4A00"/>
+                <w:sz w:val="18"/>
+              </w:rPr>
+              <w:t>Diseñado — pendiente</w:t>
+            </w:r>
+          </w:p>
+        </w:tc>
+        <w:tc>
+          <w:tcPr>
+            <w:tcW w:type="dxa" w:w="4478"/>
+            <w:shd w:val="clear" w:color="auto" w:fill="FDEBD0"/>
+          </w:tcPr>
+          <w:p>
+            <w:r/>
+            <w:r>
+              <w:rPr>
+                <w:rFonts w:ascii="Arial" w:hAnsi="Arial"/>
+                <w:b w:val="0"/>
+                <w:color w:val="9C4A00"/>
+                <w:sz w:val="18"/>
+              </w:rPr>
+              <w:t>Mecánicas de disparo aéreo/salto y oleadas cronometradas avanzadas descritas en la sección 4, sin escena implementada</w:t>
+            </w:r>
+          </w:p>
+        </w:tc>
+      </w:tr>
+      <w:tr>
+        <w:tc>
+          <w:tcPr>
+            <w:tcW w:type="dxa" w:w="2520"/>
+            <w:shd w:val="clear" w:color="auto" w:fill="FDEBD0"/>
+          </w:tcPr>
+          <w:p>
+            <w:r/>
+            <w:r>
+              <w:rPr>
+                <w:rFonts w:ascii="Arial" w:hAnsi="Arial"/>
+                <w:b/>
+                <w:color w:val="9C4A00"/>
+                <w:sz w:val="18"/>
+              </w:rPr>
+              <w:t>Boss 5 — El Coloso de Piedra</w:t>
+            </w:r>
+          </w:p>
+        </w:tc>
+        <w:tc>
+          <w:tcPr>
+            <w:tcW w:type="dxa" w:w="2362"/>
+            <w:shd w:val="clear" w:color="auto" w:fill="FDEBD0"/>
+          </w:tcPr>
+          <w:p>
+            <w:r/>
+            <w:r>
+              <w:rPr>
+                <w:rFonts w:ascii="Arial" w:hAnsi="Arial"/>
+                <w:b w:val="0"/>
+                <w:color w:val="9C4A00"/>
+                <w:sz w:val="18"/>
+              </w:rPr>
+              <w:t>Diseñado — pendiente</w:t>
+            </w:r>
+          </w:p>
+        </w:tc>
+        <w:tc>
+          <w:tcPr>
+            <w:tcW w:type="dxa" w:w="4478"/>
+            <w:shd w:val="clear" w:color="auto" w:fill="FDEBD0"/>
+          </w:tcPr>
+          <w:p>
+            <w:r/>
+            <w:r>
+              <w:rPr>
+                <w:rFonts w:ascii="Arial" w:hAnsi="Arial"/>
+                <w:b w:val="0"/>
+                <w:color w:val="9C4A00"/>
+                <w:sz w:val="18"/>
+              </w:rPr>
+              <w:t>No existe ninguna BossScene en src/scenes; las 2 fases descritas en la sección 9 son diseño puro</w:t>
+            </w:r>
+          </w:p>
+        </w:tc>
+      </w:tr>
+      <w:tr>
+        <w:tc>
+          <w:tcPr>
+            <w:tcW w:type="dxa" w:w="2520"/>
+            <w:shd w:val="clear" w:color="auto" w:fill="FDEBD0"/>
+          </w:tcPr>
+          <w:p>
+            <w:r/>
+            <w:r>
+              <w:rPr>
+                <w:rFonts w:ascii="Arial" w:hAnsi="Arial"/>
+                <w:b/>
+                <w:color w:val="9C4A00"/>
+                <w:sz w:val="18"/>
+              </w:rPr>
+              <w:t>Niveles 6–9</w:t>
+            </w:r>
+          </w:p>
+        </w:tc>
+        <w:tc>
+          <w:tcPr>
+            <w:tcW w:type="dxa" w:w="2362"/>
+            <w:shd w:val="clear" w:color="auto" w:fill="FDEBD0"/>
+          </w:tcPr>
+          <w:p>
+            <w:r/>
+            <w:r>
+              <w:rPr>
+                <w:rFonts w:ascii="Arial" w:hAnsi="Arial"/>
+                <w:b w:val="0"/>
+                <w:color w:val="9C4A00"/>
+                <w:sz w:val="18"/>
+              </w:rPr>
+              <w:t>Diseñado — pendiente</w:t>
+            </w:r>
+          </w:p>
+        </w:tc>
+        <w:tc>
+          <w:tcPr>
+            <w:tcW w:type="dxa" w:w="4478"/>
+            <w:shd w:val="clear" w:color="auto" w:fill="FDEBD0"/>
+          </w:tcPr>
+          <w:p>
+            <w:r/>
+            <w:r>
+              <w:rPr>
+                <w:rFonts w:ascii="Arial" w:hAnsi="Arial"/>
+                <w:b w:val="0"/>
+                <w:color w:val="9C4A00"/>
+                <w:sz w:val="18"/>
+              </w:rPr>
+              <w:t>Descritos en la sección 4, sin implementación</w:t>
+            </w:r>
+          </w:p>
+        </w:tc>
+      </w:tr>
+      <w:tr>
+        <w:tc>
+          <w:tcPr>
+            <w:tcW w:type="dxa" w:w="2520"/>
+            <w:shd w:val="clear" w:color="auto" w:fill="FDEBD0"/>
+          </w:tcPr>
+          <w:p>
+            <w:r/>
+            <w:r>
+              <w:rPr>
+                <w:rFonts w:ascii="Arial" w:hAnsi="Arial"/>
+                <w:b/>
+                <w:color w:val="9C4A00"/>
+                <w:sz w:val="18"/>
+              </w:rPr>
+              <w:t>Boss 10 — El Rey Escorpión</w:t>
+            </w:r>
+          </w:p>
+        </w:tc>
+        <w:tc>
+          <w:tcPr>
+            <w:tcW w:type="dxa" w:w="2362"/>
+            <w:shd w:val="clear" w:color="auto" w:fill="FDEBD0"/>
+          </w:tcPr>
+          <w:p>
+            <w:r/>
+            <w:r>
+              <w:rPr>
+                <w:rFonts w:ascii="Arial" w:hAnsi="Arial"/>
+                <w:b w:val="0"/>
+                <w:color w:val="9C4A00"/>
+                <w:sz w:val="18"/>
+              </w:rPr>
+              <w:t>Diseñado — pendiente</w:t>
+            </w:r>
+          </w:p>
+        </w:tc>
+        <w:tc>
+          <w:tcPr>
+            <w:tcW w:type="dxa" w:w="4478"/>
+            <w:shd w:val="clear" w:color="auto" w:fill="FDEBD0"/>
+          </w:tcPr>
+          <w:p>
+            <w:r/>
+            <w:r>
+              <w:rPr>
+                <w:rFonts w:ascii="Arial" w:hAnsi="Arial"/>
+                <w:b w:val="0"/>
+                <w:color w:val="9C4A00"/>
+                <w:sz w:val="18"/>
+              </w:rPr>
+              <w:t>Igual que el Boss 5: 0 líneas de código</w:t>
+            </w:r>
+          </w:p>
+        </w:tc>
+      </w:tr>
+      <w:tr>
+        <w:tc>
+          <w:tcPr>
+            <w:tcW w:type="dxa" w:w="2520"/>
+            <w:shd w:val="clear" w:color="auto" w:fill="E2F0D9"/>
+          </w:tcPr>
+          <w:p>
+            <w:r/>
+            <w:r>
+              <w:rPr>
+                <w:rFonts w:ascii="Arial" w:hAnsi="Arial"/>
+                <w:b/>
+                <w:color w:val="1E6B2E"/>
+                <w:sz w:val="18"/>
+              </w:rPr>
+              <w:t>Habilidades de flecha (10)</w:t>
+            </w:r>
+          </w:p>
+        </w:tc>
+        <w:tc>
+          <w:tcPr>
+            <w:tcW w:type="dxa" w:w="2362"/>
+            <w:shd w:val="clear" w:color="auto" w:fill="E2F0D9"/>
+          </w:tcPr>
+          <w:p>
+            <w:r/>
+            <w:r>
+              <w:rPr>
+                <w:rFonts w:ascii="Arial" w:hAnsi="Arial"/>
+                <w:b w:val="0"/>
+                <w:color w:val="1E6B2E"/>
+                <w:sz w:val="18"/>
+              </w:rPr>
+              <w:t>Implementado 10/10</w:t>
+            </w:r>
+          </w:p>
+        </w:tc>
+        <w:tc>
+          <w:tcPr>
+            <w:tcW w:type="dxa" w:w="4478"/>
+            <w:shd w:val="clear" w:color="auto" w:fill="E2F0D9"/>
+          </w:tcPr>
+          <w:p>
+            <w:r/>
+            <w:r>
+              <w:rPr>
+                <w:rFonts w:ascii="Arial" w:hAnsi="Arial"/>
+                <w:b w:val="0"/>
+                <w:color w:val="1E6B2E"/>
+                <w:sz w:val="18"/>
+              </w:rPr>
+              <w:t>Coinciden 1:1 entre config.js y la sección 6, mismos IDs y descripciones</w:t>
+            </w:r>
+          </w:p>
+        </w:tc>
+      </w:tr>
+      <w:tr>
+        <w:tc>
+          <w:tcPr>
+            <w:tcW w:type="dxa" w:w="2520"/>
+            <w:shd w:val="clear" w:color="auto" w:fill="E2F0D9"/>
+          </w:tcPr>
+          <w:p>
+            <w:r/>
+            <w:r>
+              <w:rPr>
+                <w:rFonts w:ascii="Arial" w:hAnsi="Arial"/>
+                <w:b/>
+                <w:color w:val="1E6B2E"/>
+                <w:sz w:val="18"/>
+              </w:rPr>
+              <w:t>Mejoras de stats (5)</w:t>
+            </w:r>
+          </w:p>
+        </w:tc>
+        <w:tc>
+          <w:tcPr>
+            <w:tcW w:type="dxa" w:w="2362"/>
+            <w:shd w:val="clear" w:color="auto" w:fill="E2F0D9"/>
+          </w:tcPr>
+          <w:p>
+            <w:r/>
+            <w:r>
+              <w:rPr>
+                <w:rFonts w:ascii="Arial" w:hAnsi="Arial"/>
+                <w:b w:val="0"/>
+                <w:color w:val="1E6B2E"/>
+                <w:sz w:val="18"/>
+              </w:rPr>
+              <w:t>Implementado 5/5</w:t>
+            </w:r>
+          </w:p>
+        </w:tc>
+        <w:tc>
+          <w:tcPr>
+            <w:tcW w:type="dxa" w:w="4478"/>
+            <w:shd w:val="clear" w:color="auto" w:fill="E2F0D9"/>
+          </w:tcPr>
+          <w:p>
+            <w:r/>
+            <w:r>
+              <w:rPr>
+                <w:rFonts w:ascii="Arial" w:hAnsi="Arial"/>
+                <w:b w:val="0"/>
+                <w:color w:val="1E6B2E"/>
+                <w:sz w:val="18"/>
+              </w:rPr>
+              <w:t>Coinciden 1:1 entre config.js y la sección 7, mismos costos</w:t>
+            </w:r>
+          </w:p>
+        </w:tc>
+      </w:tr>
+      <w:tr>
+        <w:tc>
+          <w:tcPr>
+            <w:tcW w:type="dxa" w:w="2520"/>
+            <w:shd w:val="clear" w:color="auto" w:fill="F7FBFF"/>
+          </w:tcPr>
+          <w:p>
+            <w:r/>
+            <w:r>
+              <w:rPr>
+                <w:rFonts w:ascii="Arial" w:hAnsi="Arial"/>
+                <w:b/>
+                <w:sz w:val="18"/>
+              </w:rPr>
+              <w:t>Bestiario</w:t>
+            </w:r>
+          </w:p>
+        </w:tc>
+        <w:tc>
+          <w:tcPr>
+            <w:tcW w:type="dxa" w:w="2362"/>
+            <w:shd w:val="clear" w:color="auto" w:fill="F7FBFF"/>
+          </w:tcPr>
+          <w:p>
+            <w:r/>
+            <w:r>
+              <w:rPr>
+                <w:rFonts w:ascii="Arial" w:hAnsi="Arial"/>
+                <w:b w:val="0"/>
+                <w:sz w:val="18"/>
+              </w:rPr>
+              <w:t>Implementado 4/6</w:t>
+            </w:r>
+          </w:p>
+        </w:tc>
+        <w:tc>
+          <w:tcPr>
+            <w:tcW w:type="dxa" w:w="4478"/>
+            <w:shd w:val="clear" w:color="auto" w:fill="F7FBFF"/>
+          </w:tcPr>
+          <w:p>
+            <w:r/>
+            <w:r>
+              <w:rPr>
+                <w:rFonts w:ascii="Arial" w:hAnsi="Arial"/>
+                <w:b w:val="0"/>
+                <w:sz w:val="18"/>
+              </w:rPr>
+              <w:t>Faltan Guardián de piedra y Espíritu de arena (ver sección 13)</w:t>
+            </w:r>
+          </w:p>
+        </w:tc>
+      </w:tr>
+      <w:tr>
+        <w:tc>
+          <w:tcPr>
+            <w:tcW w:type="dxa" w:w="2520"/>
+            <w:shd w:val="clear" w:color="auto" w:fill="FDEBD0"/>
+          </w:tcPr>
+          <w:p>
+            <w:r/>
+            <w:r>
+              <w:rPr>
+                <w:rFonts w:ascii="Arial" w:hAnsi="Arial"/>
+                <w:b/>
+                <w:color w:val="9C4A00"/>
+                <w:sz w:val="18"/>
+              </w:rPr>
+              <w:t>Identidad sonora (BGM/SFX)</w:t>
+            </w:r>
+          </w:p>
+        </w:tc>
+        <w:tc>
+          <w:tcPr>
+            <w:tcW w:type="dxa" w:w="2362"/>
+            <w:shd w:val="clear" w:color="auto" w:fill="FDEBD0"/>
+          </w:tcPr>
+          <w:p>
+            <w:r/>
+            <w:r>
+              <w:rPr>
+                <w:rFonts w:ascii="Arial" w:hAnsi="Arial"/>
+                <w:b w:val="0"/>
+                <w:color w:val="9C4A00"/>
+                <w:sz w:val="18"/>
+              </w:rPr>
+              <w:t>Diseñado — pendiente</w:t>
+            </w:r>
+          </w:p>
+        </w:tc>
+        <w:tc>
+          <w:tcPr>
+            <w:tcW w:type="dxa" w:w="4478"/>
+            <w:shd w:val="clear" w:color="auto" w:fill="FDEBD0"/>
+          </w:tcPr>
+          <w:p>
+            <w:r/>
+            <w:r>
+              <w:rPr>
+                <w:rFonts w:ascii="Arial" w:hAnsi="Arial"/>
+                <w:b w:val="0"/>
+                <w:color w:val="9C4A00"/>
+                <w:sz w:val="18"/>
+              </w:rPr>
+              <w:t>No hay archivos en assets/audio ni carga de sonido en PreloadScene.js</w:t>
+            </w:r>
+          </w:p>
+        </w:tc>
+      </w:tr>
+      <w:tr>
+        <w:tc>
+          <w:tcPr>
+            <w:tcW w:type="dxa" w:w="2520"/>
+            <w:shd w:val="clear" w:color="auto" w:fill="E2F0D9"/>
+          </w:tcPr>
+          <w:p>
+            <w:r/>
+            <w:r>
+              <w:rPr>
+                <w:rFonts w:ascii="Arial" w:hAnsi="Arial"/>
+                <w:b/>
+                <w:color w:val="1E6B2E"/>
+                <w:sz w:val="18"/>
+              </w:rPr>
+              <w:t>Menú y HUD</w:t>
+            </w:r>
+          </w:p>
+        </w:tc>
+        <w:tc>
+          <w:tcPr>
+            <w:tcW w:type="dxa" w:w="2362"/>
+            <w:shd w:val="clear" w:color="auto" w:fill="E2F0D9"/>
+          </w:tcPr>
+          <w:p>
+            <w:r/>
+            <w:r>
+              <w:rPr>
+                <w:rFonts w:ascii="Arial" w:hAnsi="Arial"/>
+                <w:b w:val="0"/>
+                <w:color w:val="1E6B2E"/>
+                <w:sz w:val="18"/>
+              </w:rPr>
+              <w:t>Implementado</w:t>
+            </w:r>
+          </w:p>
+        </w:tc>
+        <w:tc>
+          <w:tcPr>
+            <w:tcW w:type="dxa" w:w="4478"/>
+            <w:shd w:val="clear" w:color="auto" w:fill="E2F0D9"/>
+          </w:tcPr>
+          <w:p>
+            <w:r/>
+            <w:r>
+              <w:rPr>
+                <w:rFonts w:ascii="Arial" w:hAnsi="Arial"/>
+                <w:b w:val="0"/>
+                <w:color w:val="1E6B2E"/>
+                <w:sz w:val="18"/>
+              </w:rPr>
+              <w:t>MenuScene con controles explicados, UIScene con HP/score/monedas en vivo</w:t>
+            </w:r>
+          </w:p>
+        </w:tc>
+      </w:tr>
+      <w:tr>
+        <w:tc>
+          <w:tcPr>
+            <w:tcW w:type="dxa" w:w="2520"/>
+            <w:shd w:val="clear" w:color="auto" w:fill="E2F0D9"/>
+          </w:tcPr>
+          <w:p>
+            <w:r/>
+            <w:r>
+              <w:rPr>
+                <w:rFonts w:ascii="Arial" w:hAnsi="Arial"/>
+                <w:b/>
+                <w:color w:val="1E6B2E"/>
+                <w:sz w:val="18"/>
+              </w:rPr>
+              <w:t>Game Over / Victoria</w:t>
+            </w:r>
+          </w:p>
+        </w:tc>
+        <w:tc>
+          <w:tcPr>
+            <w:tcW w:type="dxa" w:w="2362"/>
+            <w:shd w:val="clear" w:color="auto" w:fill="E2F0D9"/>
+          </w:tcPr>
+          <w:p>
+            <w:r/>
+            <w:r>
+              <w:rPr>
+                <w:rFonts w:ascii="Arial" w:hAnsi="Arial"/>
+                <w:b w:val="0"/>
+                <w:color w:val="1E6B2E"/>
+                <w:sz w:val="18"/>
+              </w:rPr>
+              <w:t>Implementado (versión MVP)</w:t>
+            </w:r>
+          </w:p>
+        </w:tc>
+        <w:tc>
+          <w:tcPr>
+            <w:tcW w:type="dxa" w:w="4478"/>
+            <w:shd w:val="clear" w:color="auto" w:fill="E2F0D9"/>
+          </w:tcPr>
+          <w:p>
+            <w:r/>
+            <w:r>
+              <w:rPr>
+                <w:rFonts w:ascii="Arial" w:hAnsi="Arial"/>
+                <w:b w:val="0"/>
+                <w:color w:val="1E6B2E"/>
+                <w:sz w:val="18"/>
+              </w:rPr>
+              <w:t>GameOverScene reinicia la run; VictoryScene muestra el resumen del MVP, no del juego de 10 niveles</w:t>
+            </w:r>
+          </w:p>
+        </w:tc>
+      </w:tr>
+    </w:tbl>
+    <w:p/>
+    <w:p>
+      <w:r>
+        <w:rPr>
+          <w:rFonts w:ascii="Arial" w:hAnsi="Arial"/>
+          <w:b w:val="0"/>
+          <w:i w:val="0"/>
+          <w:sz w:val="22"/>
+        </w:rPr>
+        <w:t>Detalle importante: el "Nivel 2" del MVP no corresponde al Nivel 2 de la tabla de la sección 4 ("Dunas errantes"). Reutiliza el nombre y la mecánica de lava del Nivel 6 de la visión ("Catacumbas ardientes") como segundo y último nivel jugable del prototipo — probablemente para mostrar una muestra de mid-game en la demo, no para respetar la progresión 1→10 literal. Cualquiera que continúe el desarrollo debe decidir explícitamente si el Nivel 2 real pasa a ser "Dunas errantes" (como dice la visión) o si el roadmap se reordena para conservar las catacumbas como demo.</w:t>
+      </w:r>
+    </w:p>
+    <w:p/>
+    <w:p>
+      <w:pPr>
+        <w:pStyle w:val="Heading1"/>
+      </w:pPr>
+      <w:r>
+        <w:rPr>
+          <w:rFonts w:ascii="Arial" w:hAnsi="Arial"/>
+          <w:b/>
+          <w:color w:val="1F4E79"/>
+          <w:sz w:val="32"/>
+        </w:rPr>
+        <w:t>15. Riesgos y Mitigaciones</w:t>
+      </w:r>
+    </w:p>
+    <w:tbl>
+      <w:tblPr>
+        <w:tblW w:type="auto" w:w="0"/>
+        <w:tblLayout w:type="fixed"/>
+        <w:tblLook w:firstColumn="1" w:firstRow="1" w:lastColumn="0" w:lastRow="0" w:noHBand="0" w:noVBand="1" w:val="04A0"/>
+        <w:tblBorders>
+          <w:top w:val="single" w:color="auto" w:sz="4"/>
+          <w:left w:val="single" w:color="auto" w:sz="4"/>
+          <w:bottom w:val="single" w:color="auto" w:sz="4"/>
+          <w:right w:val="single" w:color="auto" w:sz="4"/>
+          <w:insideH w:val="single" w:color="auto" w:sz="4"/>
+          <w:insideV w:val="single" w:color="auto" w:sz="4"/>
+        </w:tblBorders>
+      </w:tblPr>
+      <w:tblGrid>
+        <w:gridCol w:w="3009"/>
+        <w:gridCol w:w="3009"/>
+        <w:gridCol w:w="3009"/>
+      </w:tblGrid>
+      <w:tr>
+        <w:tc>
+          <w:tcPr>
+            <w:tcW w:type="dxa" w:w="2520"/>
+            <w:shd w:val="clear" w:color="auto" w:fill="2E75B6"/>
+          </w:tcPr>
+          <w:p>
+            <w:r/>
+            <w:r>
+              <w:rPr>
+                <w:rFonts w:ascii="Arial" w:hAnsi="Arial"/>
+                <w:b/>
+                <w:color w:val="FFFFFF"/>
+                <w:sz w:val="18"/>
+              </w:rPr>
+              <w:t>Riesgo</w:t>
+            </w:r>
+          </w:p>
+        </w:tc>
+        <w:tc>
+          <w:tcPr>
+            <w:tcW w:type="dxa" w:w="3150"/>
+            <w:shd w:val="clear" w:color="auto" w:fill="2E75B6"/>
+          </w:tcPr>
+          <w:p>
+            <w:r/>
+            <w:r>
+              <w:rPr>
+                <w:rFonts w:ascii="Arial" w:hAnsi="Arial"/>
+                <w:b/>
+                <w:color w:val="FFFFFF"/>
+                <w:sz w:val="18"/>
+              </w:rPr>
+              <w:t>Impacto</w:t>
+            </w:r>
+          </w:p>
+        </w:tc>
+        <w:tc>
+          <w:tcPr>
+            <w:tcW w:type="dxa" w:w="3691"/>
+            <w:shd w:val="clear" w:color="auto" w:fill="2E75B6"/>
+          </w:tcPr>
+          <w:p>
+            <w:r/>
+            <w:r>
+              <w:rPr>
+                <w:rFonts w:ascii="Arial" w:hAnsi="Arial"/>
+                <w:b/>
+                <w:color w:val="FFFFFF"/>
+                <w:sz w:val="18"/>
+              </w:rPr>
+              <w:t>Mitigación</w:t>
+            </w:r>
+          </w:p>
+        </w:tc>
+      </w:tr>
+      <w:tr>
+        <w:tc>
+          <w:tcPr>
+            <w:tcW w:type="dxa" w:w="2520"/>
+            <w:shd w:val="clear" w:color="auto" w:fill="F7FBFF"/>
+          </w:tcPr>
+          <w:p>
+            <w:r/>
+            <w:r>
+              <w:rPr>
+                <w:rFonts w:ascii="Arial" w:hAnsi="Arial"/>
+                <w:b/>
+                <w:sz w:val="18"/>
+              </w:rPr>
+              <w:t>Scope creep al pasar de 2 a 10 niveles</w:t>
+            </w:r>
+          </w:p>
+        </w:tc>
+        <w:tc>
+          <w:tcPr>
+            <w:tcW w:type="dxa" w:w="3150"/>
+            <w:shd w:val="clear" w:color="auto" w:fill="F7FBFF"/>
+          </w:tcPr>
+          <w:p>
+            <w:r/>
+            <w:r>
+              <w:rPr>
+                <w:rFonts w:ascii="Arial" w:hAnsi="Arial"/>
+                <w:b w:val="0"/>
+                <w:sz w:val="18"/>
+              </w:rPr>
+              <w:t>Alto: puede consumir todo el tiempo restante sin dejar nada jugable nuevo</w:t>
+            </w:r>
+          </w:p>
+        </w:tc>
+        <w:tc>
+          <w:tcPr>
+            <w:tcW w:type="dxa" w:w="3691"/>
+            <w:shd w:val="clear" w:color="auto" w:fill="F7FBFF"/>
+          </w:tcPr>
+          <w:p>
+            <w:r/>
+            <w:r>
+              <w:rPr>
+                <w:rFonts w:ascii="Arial" w:hAnsi="Arial"/>
+                <w:b w:val="0"/>
+                <w:sz w:val="18"/>
+              </w:rPr>
+              <w:t>Congelar el diseño de niveles 3–10 tal cual está en la sección 4; no agregar mecánicas nuevas sin pasar por la sección 11</w:t>
+            </w:r>
+          </w:p>
+        </w:tc>
+      </w:tr>
+      <w:tr>
+        <w:tc>
+          <w:tcPr>
+            <w:tcW w:type="dxa" w:w="2520"/>
+            <w:shd w:val="clear" w:color="auto" w:fill="FFFFFF"/>
+          </w:tcPr>
+          <w:p>
+            <w:r/>
+            <w:r>
+              <w:rPr>
+                <w:rFonts w:ascii="Arial" w:hAnsi="Arial"/>
+                <w:b/>
+                <w:sz w:val="18"/>
+              </w:rPr>
+              <w:t>Los 2 bosses no tienen ninguna línea de código</w:t>
+            </w:r>
+          </w:p>
+        </w:tc>
+        <w:tc>
+          <w:tcPr>
+            <w:tcW w:type="dxa" w:w="3150"/>
+            <w:shd w:val="clear" w:color="auto" w:fill="FFFFFF"/>
+          </w:tcPr>
+          <w:p>
+            <w:r/>
+            <w:r>
+              <w:rPr>
+                <w:rFonts w:ascii="Arial" w:hAnsi="Arial"/>
+                <w:b w:val="0"/>
+                <w:sz w:val="18"/>
+              </w:rPr>
+              <w:t>Alto: son los hitos de mayor peso de dificultad y narrativa</w:t>
+            </w:r>
+          </w:p>
+        </w:tc>
+        <w:tc>
+          <w:tcPr>
+            <w:tcW w:type="dxa" w:w="3691"/>
+            <w:shd w:val="clear" w:color="auto" w:fill="FFFFFF"/>
+          </w:tcPr>
+          <w:p>
+            <w:r/>
+            <w:r>
+              <w:rPr>
+                <w:rFonts w:ascii="Arial" w:hAnsi="Arial"/>
+                <w:b w:val="0"/>
+                <w:sz w:val="18"/>
+              </w:rPr>
+              <w:t>Priorizar el Boss 5 antes que los niveles 6–9: un boss sólido vale más que dos niveles genéricos extra</w:t>
+            </w:r>
+          </w:p>
+        </w:tc>
+      </w:tr>
+      <w:tr>
+        <w:tc>
+          <w:tcPr>
+            <w:tcW w:type="dxa" w:w="2520"/>
+            <w:shd w:val="clear" w:color="auto" w:fill="F7FBFF"/>
+          </w:tcPr>
+          <w:p>
+            <w:r/>
+            <w:r>
+              <w:rPr>
+                <w:rFonts w:ascii="Arial" w:hAnsi="Arial"/>
+                <w:b/>
+                <w:sz w:val="18"/>
+              </w:rPr>
+              <w:t>Balance sin playtesting más allá del nivel 2</w:t>
+            </w:r>
+          </w:p>
+        </w:tc>
+        <w:tc>
+          <w:tcPr>
+            <w:tcW w:type="dxa" w:w="3150"/>
+            <w:shd w:val="clear" w:color="auto" w:fill="F7FBFF"/>
+          </w:tcPr>
+          <w:p>
+            <w:r/>
+            <w:r>
+              <w:rPr>
+                <w:rFonts w:ascii="Arial" w:hAnsi="Arial"/>
+                <w:b w:val="0"/>
+                <w:sz w:val="18"/>
+              </w:rPr>
+              <w:t>Medio: las tablas de la sección 13 solo están validadas para niveles 1–2</w:t>
+            </w:r>
+          </w:p>
+        </w:tc>
+        <w:tc>
+          <w:tcPr>
+            <w:tcW w:type="dxa" w:w="3691"/>
+            <w:shd w:val="clear" w:color="auto" w:fill="F7FBFF"/>
+          </w:tcPr>
+          <w:p>
+            <w:r/>
+            <w:r>
+              <w:rPr>
+                <w:rFonts w:ascii="Arial" w:hAnsi="Arial"/>
+                <w:b w:val="0"/>
+                <w:sz w:val="18"/>
+              </w:rPr>
+              <w:t>Extender la tabla de balance a cada nivel nuevo antes de programarlo, no después</w:t>
+            </w:r>
+          </w:p>
+        </w:tc>
+      </w:tr>
+      <w:tr>
+        <w:tc>
+          <w:tcPr>
+            <w:tcW w:type="dxa" w:w="2520"/>
+            <w:shd w:val="clear" w:color="auto" w:fill="FFFFFF"/>
+          </w:tcPr>
+          <w:p>
+            <w:r/>
+            <w:r>
+              <w:rPr>
+                <w:rFonts w:ascii="Arial" w:hAnsi="Arial"/>
+                <w:b/>
+                <w:sz w:val="18"/>
+              </w:rPr>
+              <w:t>Ausencia total de audio</w:t>
+            </w:r>
+          </w:p>
+        </w:tc>
+        <w:tc>
+          <w:tcPr>
+            <w:tcW w:type="dxa" w:w="3150"/>
+            <w:shd w:val="clear" w:color="auto" w:fill="FFFFFF"/>
+          </w:tcPr>
+          <w:p>
+            <w:r/>
+            <w:r>
+              <w:rPr>
+                <w:rFonts w:ascii="Arial" w:hAnsi="Arial"/>
+                <w:b w:val="0"/>
+                <w:sz w:val="18"/>
+              </w:rPr>
+              <w:t>Medio: la sección 10 describe una identidad sonora completa sin ningún archivo cargado</w:t>
+            </w:r>
+          </w:p>
+        </w:tc>
+        <w:tc>
+          <w:tcPr>
+            <w:tcW w:type="dxa" w:w="3691"/>
+            <w:shd w:val="clear" w:color="auto" w:fill="FFFFFF"/>
+          </w:tcPr>
+          <w:p>
+            <w:r/>
+            <w:r>
+              <w:rPr>
+                <w:rFonts w:ascii="Arial" w:hAnsi="Arial"/>
+                <w:b w:val="0"/>
+                <w:sz w:val="18"/>
+              </w:rPr>
+              <w:t>Usar SFX libres de licencia (p. ej. freesound.org) como placeholder para validar el diseño antes de encargar audio original</w:t>
+            </w:r>
+          </w:p>
+        </w:tc>
+      </w:tr>
+      <w:tr>
+        <w:tc>
+          <w:tcPr>
+            <w:tcW w:type="dxa" w:w="2520"/>
+            <w:shd w:val="clear" w:color="auto" w:fill="F7FBFF"/>
+          </w:tcPr>
+          <w:p>
+            <w:r/>
+            <w:r>
+              <w:rPr>
+                <w:rFonts w:ascii="Arial" w:hAnsi="Arial"/>
+                <w:b/>
+                <w:sz w:val="18"/>
+              </w:rPr>
+              <w:t>Curva de dificultad no verificada</w:t>
+            </w:r>
+          </w:p>
+        </w:tc>
+        <w:tc>
+          <w:tcPr>
+            <w:tcW w:type="dxa" w:w="3150"/>
+            <w:shd w:val="clear" w:color="auto" w:fill="F7FBFF"/>
+          </w:tcPr>
+          <w:p>
+            <w:r/>
+            <w:r>
+              <w:rPr>
+                <w:rFonts w:ascii="Arial" w:hAnsi="Arial"/>
+                <w:b w:val="0"/>
+                <w:sz w:val="18"/>
+              </w:rPr>
+              <w:t>Medio: el pacing en minutos de la sección 4 es estimado, no medido</w:t>
+            </w:r>
+          </w:p>
+        </w:tc>
+        <w:tc>
+          <w:tcPr>
+            <w:tcW w:type="dxa" w:w="3691"/>
+            <w:shd w:val="clear" w:color="auto" w:fill="F7FBFF"/>
+          </w:tcPr>
+          <w:p>
+            <w:r/>
+            <w:r>
+              <w:rPr>
+                <w:rFonts w:ascii="Arial" w:hAnsi="Arial"/>
+                <w:b w:val="0"/>
+                <w:sz w:val="18"/>
+              </w:rPr>
+              <w:t>Instrumentar analítica simple (tiempo por nivel, muertes por nivel) apenas haya más de 2 niveles jugables</w:t>
+            </w:r>
+          </w:p>
+        </w:tc>
+      </w:tr>
+    </w:tbl>
+    <w:p/>
+    <w:p>
+      <w:pPr>
+        <w:pStyle w:val="Heading1"/>
+      </w:pPr>
+      <w:r>
+        <w:rPr>
+          <w:rFonts w:ascii="Arial" w:hAnsi="Arial"/>
+          <w:b/>
+          <w:color w:val="1F4E79"/>
+          <w:sz w:val="32"/>
+        </w:rPr>
+        <w:t>16. Plan de Producción (Roadmap)</w:t>
+      </w:r>
+    </w:p>
+    <w:tbl>
+      <w:tblPr>
+        <w:tblW w:type="auto" w:w="0"/>
+        <w:tblLayout w:type="fixed"/>
+        <w:tblLook w:firstColumn="1" w:firstRow="1" w:lastColumn="0" w:lastRow="0" w:noHBand="0" w:noVBand="1" w:val="04A0"/>
+        <w:tblBorders>
+          <w:top w:val="single" w:color="auto" w:sz="4"/>
+          <w:left w:val="single" w:color="auto" w:sz="4"/>
+          <w:bottom w:val="single" w:color="auto" w:sz="4"/>
+          <w:right w:val="single" w:color="auto" w:sz="4"/>
+          <w:insideH w:val="single" w:color="auto" w:sz="4"/>
+          <w:insideV w:val="single" w:color="auto" w:sz="4"/>
+        </w:tblBorders>
+      </w:tblPr>
+      <w:tblGrid>
+        <w:gridCol w:w="3009"/>
+        <w:gridCol w:w="3009"/>
+        <w:gridCol w:w="3009"/>
+      </w:tblGrid>
+      <w:tr>
+        <w:tc>
+          <w:tcPr>
+            <w:tcW w:type="dxa" w:w="2205"/>
+            <w:shd w:val="clear" w:color="auto" w:fill="2E75B6"/>
+          </w:tcPr>
+          <w:p>
+            <w:r/>
+            <w:r>
+              <w:rPr>
+                <w:rFonts w:ascii="Arial" w:hAnsi="Arial"/>
+                <w:b/>
+                <w:color w:val="FFFFFF"/>
+                <w:sz w:val="18"/>
+              </w:rPr>
+              <w:t>Fase</w:t>
+            </w:r>
+          </w:p>
+        </w:tc>
+        <w:tc>
+          <w:tcPr>
+            <w:tcW w:type="dxa" w:w="5197"/>
+            <w:shd w:val="clear" w:color="auto" w:fill="2E75B6"/>
+          </w:tcPr>
+          <w:p>
+            <w:r/>
+            <w:r>
+              <w:rPr>
+                <w:rFonts w:ascii="Arial" w:hAnsi="Arial"/>
+                <w:b/>
+                <w:color w:val="FFFFFF"/>
+                <w:sz w:val="18"/>
+              </w:rPr>
+              <w:t>Contenido</w:t>
+            </w:r>
+          </w:p>
+        </w:tc>
+        <w:tc>
+          <w:tcPr>
+            <w:tcW w:type="dxa" w:w="1958"/>
+            <w:shd w:val="clear" w:color="auto" w:fill="2E75B6"/>
+          </w:tcPr>
+          <w:p>
+            <w:r/>
+            <w:r>
+              <w:rPr>
+                <w:rFonts w:ascii="Arial" w:hAnsi="Arial"/>
+                <w:b/>
+                <w:color w:val="FFFFFF"/>
+                <w:sz w:val="18"/>
+              </w:rPr>
+              <w:t>Depende de</w:t>
+            </w:r>
+          </w:p>
+        </w:tc>
+      </w:tr>
+      <w:tr>
+        <w:tc>
+          <w:tcPr>
+            <w:tcW w:type="dxa" w:w="2205"/>
+            <w:shd w:val="clear" w:color="auto" w:fill="F7FBFF"/>
+          </w:tcPr>
+          <w:p>
+            <w:r/>
+            <w:r>
+              <w:rPr>
+                <w:rFonts w:ascii="Arial" w:hAnsi="Arial"/>
+                <w:b/>
+                <w:sz w:val="18"/>
+              </w:rPr>
+              <w:t>Fase 1 — completada</w:t>
+            </w:r>
+          </w:p>
+        </w:tc>
+        <w:tc>
+          <w:tcPr>
+            <w:tcW w:type="dxa" w:w="5197"/>
+            <w:shd w:val="clear" w:color="auto" w:fill="F7FBFF"/>
+          </w:tcPr>
+          <w:p>
+            <w:r/>
+            <w:r>
+              <w:rPr>
+                <w:rFonts w:ascii="Arial" w:hAnsi="Arial"/>
+                <w:b w:val="0"/>
+                <w:sz w:val="18"/>
+              </w:rPr>
+              <w:t>MVP: niveles 1 y 2, 10 habilidades, 5 mejoras, tienda, HUD, menú</w:t>
+            </w:r>
+          </w:p>
+        </w:tc>
+        <w:tc>
+          <w:tcPr>
+            <w:tcW w:type="dxa" w:w="1958"/>
+            <w:shd w:val="clear" w:color="auto" w:fill="F7FBFF"/>
+          </w:tcPr>
+          <w:p>
+            <w:r/>
+            <w:r>
+              <w:rPr>
+                <w:rFonts w:ascii="Arial" w:hAnsi="Arial"/>
+                <w:b w:val="0"/>
+                <w:sz w:val="18"/>
+              </w:rPr>
+              <w:t>—</w:t>
+            </w:r>
+          </w:p>
+        </w:tc>
+      </w:tr>
+      <w:tr>
+        <w:tc>
+          <w:tcPr>
+            <w:tcW w:type="dxa" w:w="2205"/>
+            <w:shd w:val="clear" w:color="auto" w:fill="FFFFFF"/>
+          </w:tcPr>
+          <w:p>
+            <w:r/>
+            <w:r>
+              <w:rPr>
+                <w:rFonts w:ascii="Arial" w:hAnsi="Arial"/>
+                <w:b/>
+                <w:sz w:val="18"/>
+              </w:rPr>
+              <w:t>Fase 2</w:t>
+            </w:r>
+          </w:p>
+        </w:tc>
+        <w:tc>
+          <w:tcPr>
+            <w:tcW w:type="dxa" w:w="5197"/>
+            <w:shd w:val="clear" w:color="auto" w:fill="FFFFFF"/>
+          </w:tcPr>
+          <w:p>
+            <w:r/>
+            <w:r>
+              <w:rPr>
+                <w:rFonts w:ascii="Arial" w:hAnsi="Arial"/>
+                <w:b w:val="0"/>
+                <w:sz w:val="18"/>
+              </w:rPr>
+              <w:t>Niveles 3 y 4 + primera iteración del Boss 5 (solo fase 1, sin fragmentación)</w:t>
+            </w:r>
+          </w:p>
+        </w:tc>
+        <w:tc>
+          <w:tcPr>
+            <w:tcW w:type="dxa" w:w="1958"/>
+            <w:shd w:val="clear" w:color="auto" w:fill="FFFFFF"/>
+          </w:tcPr>
+          <w:p>
+            <w:r/>
+            <w:r>
+              <w:rPr>
+                <w:rFonts w:ascii="Arial" w:hAnsi="Arial"/>
+                <w:b w:val="0"/>
+                <w:sz w:val="18"/>
+              </w:rPr>
+              <w:t>Fase 1</w:t>
+            </w:r>
+          </w:p>
+        </w:tc>
+      </w:tr>
+      <w:tr>
+        <w:tc>
+          <w:tcPr>
+            <w:tcW w:type="dxa" w:w="2205"/>
+            <w:shd w:val="clear" w:color="auto" w:fill="F7FBFF"/>
+          </w:tcPr>
+          <w:p>
+            <w:r/>
+            <w:r>
+              <w:rPr>
+                <w:rFonts w:ascii="Arial" w:hAnsi="Arial"/>
+                <w:b/>
+                <w:sz w:val="18"/>
+              </w:rPr>
+              <w:t>Fase 3</w:t>
+            </w:r>
+          </w:p>
+        </w:tc>
+        <w:tc>
+          <w:tcPr>
+            <w:tcW w:type="dxa" w:w="5197"/>
+            <w:shd w:val="clear" w:color="auto" w:fill="F7FBFF"/>
+          </w:tcPr>
+          <w:p>
+            <w:r/>
+            <w:r>
+              <w:rPr>
+                <w:rFonts w:ascii="Arial" w:hAnsi="Arial"/>
+                <w:b w:val="0"/>
+                <w:sz w:val="18"/>
+              </w:rPr>
+              <w:t>Boss 5 completo (fase 2 con fragmentos) + Espíritu de arena + niveles 6–7</w:t>
+            </w:r>
+          </w:p>
+        </w:tc>
+        <w:tc>
+          <w:tcPr>
+            <w:tcW w:type="dxa" w:w="1958"/>
+            <w:shd w:val="clear" w:color="auto" w:fill="F7FBFF"/>
+          </w:tcPr>
+          <w:p>
+            <w:r/>
+            <w:r>
+              <w:rPr>
+                <w:rFonts w:ascii="Arial" w:hAnsi="Arial"/>
+                <w:b w:val="0"/>
+                <w:sz w:val="18"/>
+              </w:rPr>
+              <w:t>Fase 2</w:t>
+            </w:r>
+          </w:p>
+        </w:tc>
+      </w:tr>
+      <w:tr>
+        <w:tc>
+          <w:tcPr>
+            <w:tcW w:type="dxa" w:w="2205"/>
+            <w:shd w:val="clear" w:color="auto" w:fill="FFFFFF"/>
+          </w:tcPr>
+          <w:p>
+            <w:r/>
+            <w:r>
+              <w:rPr>
+                <w:rFonts w:ascii="Arial" w:hAnsi="Arial"/>
+                <w:b/>
+                <w:sz w:val="18"/>
+              </w:rPr>
+              <w:t>Fase 4</w:t>
+            </w:r>
+          </w:p>
+        </w:tc>
+        <w:tc>
+          <w:tcPr>
+            <w:tcW w:type="dxa" w:w="5197"/>
+            <w:shd w:val="clear" w:color="auto" w:fill="FFFFFF"/>
+          </w:tcPr>
+          <w:p>
+            <w:r/>
+            <w:r>
+              <w:rPr>
+                <w:rFonts w:ascii="Arial" w:hAnsi="Arial"/>
+                <w:b w:val="0"/>
+                <w:sz w:val="18"/>
+              </w:rPr>
+              <w:t>Niveles 8–9 + Guardián de piedra</w:t>
+            </w:r>
+          </w:p>
+        </w:tc>
+        <w:tc>
+          <w:tcPr>
+            <w:tcW w:type="dxa" w:w="1958"/>
+            <w:shd w:val="clear" w:color="auto" w:fill="FFFFFF"/>
+          </w:tcPr>
+          <w:p>
+            <w:r/>
+            <w:r>
+              <w:rPr>
+                <w:rFonts w:ascii="Arial" w:hAnsi="Arial"/>
+                <w:b w:val="0"/>
+                <w:sz w:val="18"/>
+              </w:rPr>
+              <w:t>Fase 3</w:t>
+            </w:r>
+          </w:p>
+        </w:tc>
+      </w:tr>
+      <w:tr>
+        <w:tc>
+          <w:tcPr>
+            <w:tcW w:type="dxa" w:w="2205"/>
+            <w:shd w:val="clear" w:color="auto" w:fill="F7FBFF"/>
+          </w:tcPr>
+          <w:p>
+            <w:r/>
+            <w:r>
+              <w:rPr>
+                <w:rFonts w:ascii="Arial" w:hAnsi="Arial"/>
+                <w:b/>
+                <w:sz w:val="18"/>
+              </w:rPr>
+              <w:t>Fase 5</w:t>
+            </w:r>
+          </w:p>
+        </w:tc>
+        <w:tc>
+          <w:tcPr>
+            <w:tcW w:type="dxa" w:w="5197"/>
+            <w:shd w:val="clear" w:color="auto" w:fill="F7FBFF"/>
+          </w:tcPr>
+          <w:p>
+            <w:r/>
+            <w:r>
+              <w:rPr>
+                <w:rFonts w:ascii="Arial" w:hAnsi="Arial"/>
+                <w:b w:val="0"/>
+                <w:sz w:val="18"/>
+              </w:rPr>
+              <w:t>Boss 10 completo (3 fases) + pantalla de victoria final real</w:t>
+            </w:r>
+          </w:p>
+        </w:tc>
+        <w:tc>
+          <w:tcPr>
+            <w:tcW w:type="dxa" w:w="1958"/>
+            <w:shd w:val="clear" w:color="auto" w:fill="F7FBFF"/>
+          </w:tcPr>
+          <w:p>
+            <w:r/>
+            <w:r>
+              <w:rPr>
+                <w:rFonts w:ascii="Arial" w:hAnsi="Arial"/>
+                <w:b w:val="0"/>
+                <w:sz w:val="18"/>
+              </w:rPr>
+              <w:t>Fase 4</w:t>
+            </w:r>
+          </w:p>
+        </w:tc>
+      </w:tr>
+      <w:tr>
+        <w:tc>
+          <w:tcPr>
+            <w:tcW w:type="dxa" w:w="2205"/>
+            <w:shd w:val="clear" w:color="auto" w:fill="FFFFFF"/>
+          </w:tcPr>
+          <w:p>
+            <w:r/>
+            <w:r>
+              <w:rPr>
+                <w:rFonts w:ascii="Arial" w:hAnsi="Arial"/>
+                <w:b/>
+                <w:sz w:val="18"/>
+              </w:rPr>
+              <w:t>Fase 6</w:t>
+            </w:r>
+          </w:p>
+        </w:tc>
+        <w:tc>
+          <w:tcPr>
+            <w:tcW w:type="dxa" w:w="5197"/>
+            <w:shd w:val="clear" w:color="auto" w:fill="FFFFFF"/>
+          </w:tcPr>
+          <w:p>
+            <w:r/>
+            <w:r>
+              <w:rPr>
+                <w:rFonts w:ascii="Arial" w:hAnsi="Arial"/>
+                <w:b w:val="0"/>
+                <w:sz w:val="18"/>
+              </w:rPr>
+              <w:t>Identidad sonora completa: BGM por tramo, SFX y foley</w:t>
+            </w:r>
+          </w:p>
+        </w:tc>
+        <w:tc>
+          <w:tcPr>
+            <w:tcW w:type="dxa" w:w="1958"/>
+            <w:shd w:val="clear" w:color="auto" w:fill="FFFFFF"/>
+          </w:tcPr>
+          <w:p>
+            <w:r/>
+            <w:r>
+              <w:rPr>
+                <w:rFonts w:ascii="Arial" w:hAnsi="Arial"/>
+                <w:b w:val="0"/>
+                <w:sz w:val="18"/>
+              </w:rPr>
+              <w:t>Puede correr en paralelo desde la Fase 2</w:t>
+            </w:r>
+          </w:p>
+        </w:tc>
+      </w:tr>
+    </w:tbl>
+    <w:p/>
+    <w:p>
+      <w:pPr>
+        <w:pStyle w:val="Heading1"/>
+      </w:pPr>
+      <w:r>
+        <w:rPr>
+          <w:rFonts w:ascii="Arial" w:hAnsi="Arial"/>
+          <w:b/>
+          <w:color w:val="1F4E79"/>
+          <w:sz w:val="32"/>
+        </w:rPr>
+        <w:t>17. Referencias e Inspiración</w:t>
+      </w:r>
+    </w:p>
+    <w:tbl>
+      <w:tblPr>
+        <w:tblW w:type="auto" w:w="0"/>
+        <w:tblLayout w:type="fixed"/>
+        <w:tblLook w:firstColumn="1" w:firstRow="1" w:lastColumn="0" w:lastRow="0" w:noHBand="0" w:noVBand="1" w:val="04A0"/>
+        <w:tblBorders>
+          <w:top w:val="single" w:color="auto" w:sz="4"/>
+          <w:left w:val="single" w:color="auto" w:sz="4"/>
+          <w:bottom w:val="single" w:color="auto" w:sz="4"/>
+          <w:right w:val="single" w:color="auto" w:sz="4"/>
+          <w:insideH w:val="single" w:color="auto" w:sz="4"/>
+          <w:insideV w:val="single" w:color="auto" w:sz="4"/>
+        </w:tblBorders>
+      </w:tblPr>
+      <w:tblGrid>
+        <w:gridCol w:w="4513"/>
+        <w:gridCol w:w="4513"/>
+      </w:tblGrid>
+      <w:tr>
+        <w:tc>
+          <w:tcPr>
+            <w:tcW w:type="dxa" w:w="2800"/>
+            <w:shd w:val="clear" w:color="auto" w:fill="D6E4F0"/>
+          </w:tcPr>
+          <w:p>
+            <w:r/>
+            <w:r>
+              <w:rPr>
+                <w:rFonts w:ascii="Arial" w:hAnsi="Arial"/>
+                <w:b/>
+                <w:sz w:val="20"/>
+              </w:rPr>
+              <w:t>Vampire Survivors</w:t>
+            </w:r>
+          </w:p>
+        </w:tc>
+        <w:tc>
+          <w:tcPr>
+            <w:tcW w:type="dxa" w:w="6560"/>
+          </w:tcPr>
+          <w:p>
+            <w:r/>
+            <w:r>
+              <w:rPr>
+                <w:rFonts w:ascii="Arial" w:hAnsi="Arial"/>
+                <w:b w:val="0"/>
+                <w:sz w:val="20"/>
+              </w:rPr>
+              <w:t>Elección de habilidades acumulables cada oleada — inspira la sección 6</w:t>
+            </w:r>
+          </w:p>
+        </w:tc>
+      </w:tr>
+      <w:tr>
+        <w:tc>
+          <w:tcPr>
+            <w:tcW w:type="dxa" w:w="2800"/>
+            <w:shd w:val="clear" w:color="auto" w:fill="D6E4F0"/>
+          </w:tcPr>
+          <w:p>
+            <w:r/>
+            <w:r>
+              <w:rPr>
+                <w:rFonts w:ascii="Arial" w:hAnsi="Arial"/>
+                <w:b/>
+                <w:sz w:val="20"/>
+              </w:rPr>
+              <w:t>Hades</w:t>
+            </w:r>
+          </w:p>
+        </w:tc>
+        <w:tc>
+          <w:tcPr>
+            <w:tcW w:type="dxa" w:w="6560"/>
+          </w:tcPr>
+          <w:p>
+            <w:r/>
+            <w:r>
+              <w:rPr>
+                <w:rFonts w:ascii="Arial" w:hAnsi="Arial"/>
+                <w:b w:val="0"/>
+                <w:sz w:val="20"/>
+              </w:rPr>
+              <w:t>Muerte con pérdida de progreso pero aprendizaje de patrones — inspira el modo de muerte roguelike puro</w:t>
+            </w:r>
+          </w:p>
+        </w:tc>
+      </w:tr>
+      <w:tr>
+        <w:tc>
+          <w:tcPr>
+            <w:tcW w:type="dxa" w:w="2800"/>
+            <w:shd w:val="clear" w:color="auto" w:fill="D6E4F0"/>
+          </w:tcPr>
+          <w:p>
+            <w:r/>
+            <w:r>
+              <w:rPr>
+                <w:rFonts w:ascii="Arial" w:hAnsi="Arial"/>
+                <w:b/>
+                <w:sz w:val="20"/>
+              </w:rPr>
+              <w:t>Nuclear Throne</w:t>
+            </w:r>
+          </w:p>
+        </w:tc>
+        <w:tc>
+          <w:tcPr>
+            <w:tcW w:type="dxa" w:w="6560"/>
+          </w:tcPr>
+          <w:p>
+            <w:r/>
+            <w:r>
+              <w:rPr>
+                <w:rFonts w:ascii="Arial" w:hAnsi="Arial"/>
+                <w:b w:val="0"/>
+                <w:sz w:val="20"/>
+              </w:rPr>
+              <w:t>Ritmo rápido de disparo y enemigos en oleadas — inspira el loop de la sección 3</w:t>
+            </w:r>
+          </w:p>
+        </w:tc>
+      </w:tr>
+      <w:tr>
+        <w:tc>
+          <w:tcPr>
+            <w:tcW w:type="dxa" w:w="2800"/>
+            <w:shd w:val="clear" w:color="auto" w:fill="D6E4F0"/>
+          </w:tcPr>
+          <w:p>
+            <w:r/>
+            <w:r>
+              <w:rPr>
+                <w:rFonts w:ascii="Arial" w:hAnsi="Arial"/>
+                <w:b/>
+                <w:sz w:val="20"/>
+              </w:rPr>
+              <w:t>Path of Exile</w:t>
+            </w:r>
+          </w:p>
+        </w:tc>
+        <w:tc>
+          <w:tcPr>
+            <w:tcW w:type="dxa" w:w="6560"/>
+          </w:tcPr>
+          <w:p>
+            <w:r/>
+            <w:r>
+              <w:rPr>
+                <w:rFonts w:ascii="Arial" w:hAnsi="Arial"/>
+                <w:b w:val="0"/>
+                <w:sz w:val="20"/>
+              </w:rPr>
+              <w:t>Referencia de cómo comunicar mejoras de stats simples sin abrumar al jugador — sección 7</w:t>
+            </w:r>
+          </w:p>
+        </w:tc>
+      </w:tr>
+    </w:tbl>
+    <w:p/>
+    <w:p>
+      <w:pPr>
+        <w:pStyle w:val="Heading1"/>
+      </w:pPr>
+      <w:r>
+        <w:rPr>
+          <w:rFonts w:ascii="Arial" w:hAnsi="Arial"/>
+          <w:b/>
+          <w:color w:val="1F4E79"/>
+          <w:sz w:val="32"/>
+        </w:rPr>
+        <w:t>18. Equipo y Créditos</w:t>
+      </w:r>
+    </w:p>
+    <w:tbl>
+      <w:tblPr>
+        <w:tblW w:type="auto" w:w="0"/>
+        <w:tblLayout w:type="fixed"/>
+        <w:tblLook w:firstColumn="1" w:firstRow="1" w:lastColumn="0" w:lastRow="0" w:noHBand="0" w:noVBand="1" w:val="04A0"/>
+        <w:tblBorders>
+          <w:top w:val="single" w:color="auto" w:sz="4"/>
+          <w:left w:val="single" w:color="auto" w:sz="4"/>
+          <w:bottom w:val="single" w:color="auto" w:sz="4"/>
+          <w:right w:val="single" w:color="auto" w:sz="4"/>
+          <w:insideH w:val="single" w:color="auto" w:sz="4"/>
+          <w:insideV w:val="single" w:color="auto" w:sz="4"/>
+        </w:tblBorders>
+      </w:tblPr>
+      <w:tblGrid>
+        <w:gridCol w:w="4513"/>
+        <w:gridCol w:w="4513"/>
+      </w:tblGrid>
+      <w:tr>
+        <w:tc>
+          <w:tcPr>
+            <w:tcW w:type="dxa" w:w="2800"/>
+            <w:shd w:val="clear" w:color="auto" w:fill="D6E4F0"/>
+          </w:tcPr>
+          <w:p>
+            <w:r/>
+            <w:r>
+              <w:rPr>
+                <w:rFonts w:ascii="Arial" w:hAnsi="Arial"/>
+                <w:b/>
+                <w:sz w:val="20"/>
+              </w:rPr>
+              <w:t>Diseño de juego</w:t>
+            </w:r>
+          </w:p>
+        </w:tc>
+        <w:tc>
+          <w:tcPr>
+            <w:tcW w:type="dxa" w:w="6560"/>
+          </w:tcPr>
+          <w:p>
+            <w:r/>
+            <w:r>
+              <w:rPr>
+                <w:rFonts w:ascii="Arial" w:hAnsi="Arial"/>
+                <w:b w:val="0"/>
+                <w:sz w:val="20"/>
+              </w:rPr>
+              <w:t>[Nombre]</w:t>
+            </w:r>
+          </w:p>
+        </w:tc>
+      </w:tr>
+      <w:tr>
+        <w:tc>
+          <w:tcPr>
+            <w:tcW w:type="dxa" w:w="2800"/>
+            <w:shd w:val="clear" w:color="auto" w:fill="D6E4F0"/>
+          </w:tcPr>
+          <w:p>
+            <w:r/>
+            <w:r>
+              <w:rPr>
+                <w:rFonts w:ascii="Arial" w:hAnsi="Arial"/>
+                <w:b/>
+                <w:sz w:val="20"/>
+              </w:rPr>
+              <w:t>Programación</w:t>
+            </w:r>
+          </w:p>
+        </w:tc>
+        <w:tc>
+          <w:tcPr>
+            <w:tcW w:type="dxa" w:w="6560"/>
+          </w:tcPr>
+          <w:p>
+            <w:r/>
+            <w:r>
+              <w:rPr>
+                <w:rFonts w:ascii="Arial" w:hAnsi="Arial"/>
+                <w:b w:val="0"/>
+                <w:sz w:val="20"/>
+              </w:rPr>
+              <w:t>[Nombre]</w:t>
+            </w:r>
+          </w:p>
+        </w:tc>
+      </w:tr>
+      <w:tr>
+        <w:tc>
+          <w:tcPr>
+            <w:tcW w:type="dxa" w:w="2800"/>
+            <w:shd w:val="clear" w:color="auto" w:fill="D6E4F0"/>
+          </w:tcPr>
+          <w:p>
+            <w:r/>
+            <w:r>
+              <w:rPr>
+                <w:rFonts w:ascii="Arial" w:hAnsi="Arial"/>
+                <w:b/>
+                <w:sz w:val="20"/>
+              </w:rPr>
+              <w:t>Arte / Assets</w:t>
+            </w:r>
+          </w:p>
+        </w:tc>
+        <w:tc>
+          <w:tcPr>
+            <w:tcW w:type="dxa" w:w="6560"/>
+          </w:tcPr>
+          <w:p>
+            <w:r/>
+            <w:r>
+              <w:rPr>
+                <w:rFonts w:ascii="Arial" w:hAnsi="Arial"/>
+                <w:b w:val="0"/>
+                <w:sz w:val="20"/>
+              </w:rPr>
+              <w:t>[Nombre] — el MVP usa gráficos generados por código, ver sección 12</w:t>
+            </w:r>
+          </w:p>
+        </w:tc>
+      </w:tr>
+      <w:tr>
+        <w:tc>
+          <w:tcPr>
+            <w:tcW w:type="dxa" w:w="2800"/>
+            <w:shd w:val="clear" w:color="auto" w:fill="D6E4F0"/>
+          </w:tcPr>
+          <w:p>
+            <w:r/>
+            <w:r>
+              <w:rPr>
+                <w:rFonts w:ascii="Arial" w:hAnsi="Arial"/>
+                <w:b/>
+                <w:sz w:val="20"/>
+              </w:rPr>
+              <w:t>Sonido</w:t>
+            </w:r>
+          </w:p>
+        </w:tc>
+        <w:tc>
+          <w:tcPr>
+            <w:tcW w:type="dxa" w:w="6560"/>
+          </w:tcPr>
+          <w:p>
+            <w:r/>
+            <w:r>
+              <w:rPr>
+                <w:rFonts w:ascii="Arial" w:hAnsi="Arial"/>
+                <w:b w:val="0"/>
+                <w:sz w:val="20"/>
+              </w:rPr>
+              <w:t>[Nombre] — pendiente, ver sección 15</w:t>
+            </w:r>
+          </w:p>
+        </w:tc>
+      </w:tr>
+      <w:tr>
+        <w:tc>
+          <w:tcPr>
+            <w:tcW w:type="dxa" w:w="2800"/>
+            <w:shd w:val="clear" w:color="auto" w:fill="D6E4F0"/>
+          </w:tcPr>
+          <w:p>
+            <w:r/>
+            <w:r>
+              <w:rPr>
+                <w:rFonts w:ascii="Arial" w:hAnsi="Arial"/>
+                <w:b/>
+                <w:sz w:val="20"/>
+              </w:rPr>
+              <w:t>Docente / Revisor</w:t>
+            </w:r>
+          </w:p>
+        </w:tc>
+        <w:tc>
+          <w:tcPr>
+            <w:tcW w:type="dxa" w:w="6560"/>
+          </w:tcPr>
+          <w:p>
+            <w:r/>
+            <w:r>
+              <w:rPr>
+                <w:rFonts w:ascii="Arial" w:hAnsi="Arial"/>
+                <w:b w:val="0"/>
+                <w:sz w:val="20"/>
+              </w:rPr>
+              <w:t>[Nombre del docente]</w:t>
+            </w:r>
+          </w:p>
+        </w:tc>
+      </w:tr>
+      <w:tr>
+        <w:tc>
+          <w:tcPr>
+            <w:tcW w:type="dxa" w:w="2800"/>
+            <w:shd w:val="clear" w:color="auto" w:fill="D6E4F0"/>
+          </w:tcPr>
+          <w:p>
+            <w:r/>
+            <w:r>
+              <w:rPr>
+                <w:rFonts w:ascii="Arial" w:hAnsi="Arial"/>
+                <w:b/>
+                <w:sz w:val="20"/>
+              </w:rPr>
+              <w:t>Repositorio</w:t>
+            </w:r>
+          </w:p>
+        </w:tc>
+        <w:tc>
+          <w:tcPr>
+            <w:tcW w:type="dxa" w:w="6560"/>
+          </w:tcPr>
+          <w:p>
+            <w:r/>
+            <w:r>
+              <w:rPr>
+                <w:rFonts w:ascii="Arial" w:hAnsi="Arial"/>
+                <w:b w:val="0"/>
+                <w:sz w:val="20"/>
+              </w:rPr>
+              <w:t>[URL del repositorio]</w:t>
+            </w:r>
+          </w:p>
+        </w:tc>
+      </w:tr>
+    </w:tbl>
+    <w:p/>
     <w:p>
       <w:pPr>
         <w:pBdr>
@@ -6327,7 +10344,7 @@
           <w:sz w:val="22"/>
           <w:szCs w:val="22"/>
         </w:rPr>
-        <w:t xml:space="preserve">"Un juego bien documentado es un juego que se puede terminar. La delimitacion tecnica evita el scope creep y asegura que el equipo trabaje sobre una vision unificada."</w:t>
+        <w:t>"Un juego bien documentado es un juego que se puede terminar. La delimitación técnica evita el scope creep y asegura que el equipo trabaje sobre una visión unificada."</w:t>
       </w:r>
     </w:p>
     <w:p>

</xml_diff>